<commit_message>
Renomme l'application Qribna en Reparé’Lik
Page de garde (docx et PDF), \docapp, auteur, sous-section 1.5,
maquettes et README. Ajoute aussi l'environnement Docker.

Co-Authored-By: Claude Opus 5.5 <noreply@anthropic.com>
</commit_message>
<xml_diff>
--- a/docs/Page de garde.docx
+++ b/docs/Page de garde.docx
@@ -1,12 +1,11 @@
 
 <file path=word/document.xml><?xml version="1.0" encoding="utf-8"?>
-<w:document xmlns:mc="http://schemas.openxmlformats.org/markup-compatibility/2006" xmlns:ve="http://schemas.openxmlformats.org/markup-compatibility/2006" xmlns:o="urn:schemas-microsoft-com:office:office" xmlns:r="http://schemas.openxmlformats.org/officeDocument/2006/relationships" xmlns:m="http://schemas.openxmlformats.org/officeDocument/2006/math" xmlns:v="urn:schemas-microsoft-com:vml" xmlns:wp="http://schemas.openxmlformats.org/drawingml/2006/wordprocessingDrawing" xmlns:w10="urn:schemas-microsoft-com:office:word" xmlns:w="http://schemas.openxmlformats.org/wordprocessingml/2006/main" xmlns:wne="http://schemas.microsoft.com/office/word/2006/wordml" xmlns:a="http://schemas.openxmlformats.org/drawingml/2006/main" xmlns:pic="http://schemas.openxmlformats.org/drawingml/2006/picture" xmlns:wpg="http://schemas.microsoft.com/office/word/2010/wordprocessingGroup" xmlns:wps="http://schemas.microsoft.com/office/word/2010/wordprocessingShape" xmlns:w14="http://schemas.microsoft.com/office/word/2010/wordml" mc:Ignorable="w14" xml:space="preserve">
+<w:document xmlns:wpc="http://schemas.microsoft.com/office/word/2010/wordprocessingCanvas" xmlns:cx="http://schemas.microsoft.com/office/drawing/2014/chartex" xmlns:cx1="http://schemas.microsoft.com/office/drawing/2015/9/8/chartex" xmlns:cx2="http://schemas.microsoft.com/office/drawing/2015/10/21/chartex" xmlns:cx3="http://schemas.microsoft.com/office/drawing/2016/5/9/chartex" xmlns:cx4="http://schemas.microsoft.com/office/drawing/2016/5/10/chartex" xmlns:cx5="http://schemas.microsoft.com/office/drawing/2016/5/11/chartex" xmlns:cx6="http://schemas.microsoft.com/office/drawing/2016/5/12/chartex" xmlns:cx7="http://schemas.microsoft.com/office/drawing/2016/5/13/chartex" xmlns:cx8="http://schemas.microsoft.com/office/drawing/2016/5/14/chartex" xmlns:mc="http://schemas.openxmlformats.org/markup-compatibility/2006" xmlns:aink="http://schemas.microsoft.com/office/drawing/2016/ink" xmlns:am3d="http://schemas.microsoft.com/office/drawing/2017/model3d" xmlns:o="urn:schemas-microsoft-com:office:office" xmlns:oel="http://schemas.microsoft.com/office/2019/extlst" xmlns:r="http://schemas.openxmlformats.org/officeDocument/2006/relationships" xmlns:m="http://schemas.openxmlformats.org/officeDocument/2006/math" xmlns:v="urn:schemas-microsoft-com:vml" xmlns:wp14="http://schemas.microsoft.com/office/word/2010/wordprocessingDrawing" xmlns:wp="http://schemas.openxmlformats.org/drawingml/2006/wordprocessingDrawing" xmlns:w10="urn:schemas-microsoft-com:office:word" xmlns:w="http://schemas.openxmlformats.org/wordprocessingml/2006/main" xmlns:w14="http://schemas.microsoft.com/office/word/2010/wordml" xmlns:w15="http://schemas.microsoft.com/office/word/2012/wordml" xmlns:w16cex="http://schemas.microsoft.com/office/word/2018/wordml/cex" xmlns:w16cid="http://schemas.microsoft.com/office/word/2016/wordml/cid" xmlns:w16="http://schemas.microsoft.com/office/word/2018/wordml" xmlns:w16du="http://schemas.microsoft.com/office/word/2023/wordml/word16du" xmlns:w16sdtdh="http://schemas.microsoft.com/office/word/2020/wordml/sdtdatahash" xmlns:w16sdtfl="http://schemas.microsoft.com/office/word/2024/wordml/sdtformatlock" xmlns:w16se="http://schemas.microsoft.com/office/word/2015/wordml/symex" xmlns:wpg="http://schemas.microsoft.com/office/word/2010/wordprocessingGroup" xmlns:wpi="http://schemas.microsoft.com/office/word/2010/wordprocessingInk" xmlns:wne="http://schemas.microsoft.com/office/word/2006/wordml" xmlns:wps="http://schemas.microsoft.com/office/word/2010/wordprocessingShape" mc:Ignorable="w14 w15 w16se w16cid w16 w16cex w16sdtdh w16sdtfl w16du wp14">
   <w:body>
     <w:p>
       <w:pPr>
-        <w:spacing w:line="369" w:lineRule="auto" w:before="85"/>
+        <w:spacing w:before="85" w:line="369" w:lineRule="auto"/>
         <w:ind w:left="3088" w:right="2204" w:firstLine="523"/>
-        <w:jc w:val="left"/>
         <w:rPr>
           <w:rFonts w:ascii="Cambria"/>
           <w:sz w:val="19"/>
@@ -15,12 +14,13 @@
       <w:r>
         <w:rPr>
           <w:rFonts w:ascii="Cambria"/>
+          <w:noProof/>
           <w:sz w:val="19"/>
         </w:rPr>
         <mc:AlternateContent>
           <mc:Choice Requires="wps">
             <w:drawing>
-              <wp:anchor distT="0" distB="0" distL="0" distR="0" allowOverlap="1" layoutInCell="1" locked="0" behindDoc="1" simplePos="0" relativeHeight="487549440">
+              <wp:anchor distT="0" distB="0" distL="0" distR="0" simplePos="0" relativeHeight="487549440" behindDoc="1" locked="0" layoutInCell="1" allowOverlap="1" wp14:anchorId="57A95C7F" wp14:editId="174E6056">
                 <wp:simplePos x="0" y="0"/>
                 <wp:positionH relativeFrom="page">
                   <wp:posOffset>0</wp:posOffset>
@@ -33,27 +33,29 @@
                 <wp:wrapNone/>
                 <wp:docPr id="1" name="Group 1"/>
                 <wp:cNvGraphicFramePr>
-                  <a:graphicFrameLocks/>
+                  <a:graphicFrameLocks xmlns:a="http://schemas.openxmlformats.org/drawingml/2006/main"/>
                 </wp:cNvGraphicFramePr>
-                <a:graphic>
+                <a:graphic xmlns:a="http://schemas.openxmlformats.org/drawingml/2006/main">
                   <a:graphicData uri="http://schemas.microsoft.com/office/word/2010/wordprocessingGroup">
                     <wpg:wgp>
-                      <wpg:cNvPr id="1" name="Group 1"/>
-                      <wpg:cNvGrpSpPr/>
+                      <wpg:cNvGrpSpPr>
+                        <a:grpSpLocks/>
+                      </wpg:cNvGrpSpPr>
                       <wpg:grpSpPr>
                         <a:xfrm>
                           <a:off x="0" y="0"/>
                           <a:ext cx="7574915" cy="10693400"/>
+                          <a:chOff x="0" y="0"/>
                           <a:chExt cx="7574915" cy="10693400"/>
                         </a:xfrm>
                       </wpg:grpSpPr>
-                      <pic:pic>
+                      <pic:pic xmlns:pic="http://schemas.openxmlformats.org/drawingml/2006/picture">
                         <pic:nvPicPr>
                           <pic:cNvPr id="2" name="Image 2"/>
                           <pic:cNvPicPr/>
                         </pic:nvPicPr>
                         <pic:blipFill>
-                          <a:blip r:embed="rId5" cstate="print"/>
+                          <a:blip r:embed="rId4" cstate="print"/>
                           <a:stretch>
                             <a:fillRect/>
                           </a:stretch>
@@ -68,13 +70,13 @@
                           </a:prstGeom>
                         </pic:spPr>
                       </pic:pic>
-                      <pic:pic>
+                      <pic:pic xmlns:pic="http://schemas.openxmlformats.org/drawingml/2006/picture">
                         <pic:nvPicPr>
                           <pic:cNvPr id="3" name="Image 3"/>
                           <pic:cNvPicPr/>
                         </pic:nvPicPr>
                         <pic:blipFill>
-                          <a:blip r:embed="rId6" cstate="print"/>
+                          <a:blip r:embed="rId5" cstate="print"/>
                           <a:stretch>
                             <a:fillRect/>
                           </a:stretch>
@@ -89,13 +91,13 @@
                           </a:prstGeom>
                         </pic:spPr>
                       </pic:pic>
-                      <pic:pic>
+                      <pic:pic xmlns:pic="http://schemas.openxmlformats.org/drawingml/2006/picture">
                         <pic:nvPicPr>
                           <pic:cNvPr id="4" name="Image 4"/>
                           <pic:cNvPicPr/>
                         </pic:nvPicPr>
                         <pic:blipFill>
-                          <a:blip r:embed="rId7" cstate="print"/>
+                          <a:blip r:embed="rId6" cstate="print"/>
                           <a:stretch>
                             <a:fillRect/>
                           </a:stretch>
@@ -110,13 +112,13 @@
                           </a:prstGeom>
                         </pic:spPr>
                       </pic:pic>
-                      <pic:pic>
+                      <pic:pic xmlns:pic="http://schemas.openxmlformats.org/drawingml/2006/picture">
                         <pic:nvPicPr>
                           <pic:cNvPr id="9" name="Image 9"/>
                           <pic:cNvPicPr/>
                         </pic:nvPicPr>
                         <pic:blipFill>
-                          <a:blip r:embed="rId12" cstate="print"/>
+                          <a:blip r:embed="rId7" cstate="print"/>
                           <a:stretch>
                             <a:fillRect/>
                           </a:stretch>
@@ -392,17 +394,17 @@
               </wp:anchor>
             </w:drawing>
           </mc:Choice>
-          <mc:Fallback>
+          <mc:Fallback xmlns:pic="http://schemas.openxmlformats.org/drawingml/2006/picture" xmlns:a="http://schemas.openxmlformats.org/drawingml/2006/main" xmlns:ve="http://schemas.openxmlformats.org/markup-compatibility/2006">
             <w:pict>
               <v:group style="position:absolute;margin-left:.000009pt;margin-top:.00002pt;width:596.450pt;height:842pt;mso-position-horizontal-relative:page;mso-position-vertical-relative:page;z-index:-15767040" id="docshapegroup1" coordorigin="0,0" coordsize="11929,16840">
                 <v:shape style="position:absolute;left:0;top:0;width:5678;height:6814" type="#_x0000_t75" id="docshape2" stroked="false">
-                  <v:imagedata r:id="rId5" o:title=""/>
+                  <v:imagedata r:id="rId8" o:title=""/>
                 </v:shape>
                 <v:shape style="position:absolute;left:701;top:861;width:1993;height:1424" type="#_x0000_t75" id="docshape3" stroked="false">
-                  <v:imagedata r:id="rId6" o:title=""/>
+                  <v:imagedata r:id="rId9" o:title=""/>
                 </v:shape>
                 <v:shape style="position:absolute;left:6232;top:10030;width:5677;height:6810" type="#_x0000_t75" id="docshape4" stroked="false">
-                  <v:imagedata r:id="rId7" o:title=""/>
+                  <v:imagedata r:id="rId10" o:title=""/>
                 </v:shape>
                 <v:shape style="position:absolute;left:9650;top:923;width:1424;height:1459" type="#_x0000_t75" id="docshape9" stroked="false">
                   <v:imagedata r:id="rId12" o:title=""/>
@@ -431,7 +433,7 @@
           <w:w w:val="120"/>
           <w:sz w:val="19"/>
         </w:rPr>
-        <w:t>AUME DU </w:t>
+        <w:t xml:space="preserve">AUME DU </w:t>
       </w:r>
       <w:r>
         <w:rPr>
@@ -447,7 +449,7 @@
           <w:w w:val="120"/>
           <w:sz w:val="19"/>
         </w:rPr>
-        <w:t>AROC </w:t>
+        <w:t xml:space="preserve">AROC </w:t>
       </w:r>
       <w:r>
         <w:rPr>
@@ -463,7 +465,7 @@
           <w:w w:val="115"/>
           <w:sz w:val="19"/>
         </w:rPr>
-        <w:t>AUT </w:t>
+        <w:t xml:space="preserve">AUT </w:t>
       </w:r>
       <w:r>
         <w:rPr>
@@ -479,7 +481,7 @@
           <w:w w:val="115"/>
           <w:sz w:val="19"/>
         </w:rPr>
-        <w:t>ISSARIAT AU </w:t>
+        <w:t xml:space="preserve">ISSARIAT AU </w:t>
       </w:r>
       <w:r>
         <w:rPr>
@@ -500,9 +502,8 @@
     </w:p>
     <w:p>
       <w:pPr>
-        <w:spacing w:line="369" w:lineRule="auto" w:before="0"/>
+        <w:spacing w:line="369" w:lineRule="auto"/>
         <w:ind w:left="3254" w:right="1791" w:hanging="485"/>
-        <w:jc w:val="left"/>
         <w:rPr>
           <w:rFonts w:ascii="Cambria" w:hAnsi="Cambria"/>
           <w:sz w:val="19"/>
@@ -523,7 +524,7 @@
           <w:w w:val="120"/>
           <w:sz w:val="19"/>
         </w:rPr>
-        <w:t> </w:t>
+        <w:t xml:space="preserve"> </w:t>
       </w:r>
       <w:r>
         <w:rPr>
@@ -548,7 +549,7 @@
           <w:w w:val="120"/>
           <w:sz w:val="19"/>
         </w:rPr>
-        <w:t> </w:t>
+        <w:t xml:space="preserve"> </w:t>
       </w:r>
       <w:r>
         <w:rPr>
@@ -565,7 +566,7 @@
           <w:w w:val="120"/>
           <w:sz w:val="19"/>
         </w:rPr>
-        <w:t> </w:t>
+        <w:t xml:space="preserve"> </w:t>
       </w:r>
       <w:r>
         <w:rPr>
@@ -597,7 +598,7 @@
           <w:w w:val="120"/>
           <w:sz w:val="19"/>
         </w:rPr>
-        <w:t>ONOMIE </w:t>
+        <w:t xml:space="preserve">ONOMIE </w:t>
       </w:r>
       <w:r>
         <w:rPr>
@@ -618,8 +619,8 @@
     </w:p>
     <w:p>
       <w:pPr>
-        <w:spacing w:line="643" w:lineRule="exact" w:before="0"/>
-        <w:ind w:left="914" w:right="0" w:firstLine="0"/>
+        <w:spacing w:line="643" w:lineRule="exact"/>
+        <w:ind w:left="914"/>
         <w:jc w:val="center"/>
         <w:rPr>
           <w:rFonts w:ascii="Trebuchet MS"/>
@@ -639,18 +640,11 @@
     </w:p>
     <w:p>
       <w:pPr>
-        <w:spacing w:before="0" w:after="0" w:line="2350" w:lineRule="exact"/>
+        <w:spacing w:line="2350" w:lineRule="exact"/>
       </w:pPr>
-      <w:r>
-        <w:rPr>
-          <w:sz w:val="2"/>
-        </w:rPr>
-        <w:t/>
-      </w:r>
     </w:p>
     <w:p>
       <w:pPr>
-        <w:spacing w:before="0" w:after="0" w:line="240" w:lineRule="auto"/>
         <w:jc w:val="center"/>
       </w:pPr>
       <w:r>
@@ -662,24 +656,18 @@
           <w:spacing w:val="60"/>
           <w:sz w:val="24"/>
           <w:szCs w:val="24"/>
-          <w:lang w:val="fr-FR"/>
-        </w:rPr>
-        <w:t xml:space="preserve">CAHIER DES CHARGES FONCTIONNEL</w:t>
+        </w:rPr>
+        <w:t>CAHIER DES CHARGES FONCTIONNEL</w:t>
       </w:r>
     </w:p>
     <w:p>
       <w:pPr>
-        <w:spacing w:before="0" w:after="0" w:line="180" w:lineRule="exact"/>
+        <w:spacing w:line="180" w:lineRule="exact"/>
       </w:pPr>
-      <w:r>
-        <w:rPr>
-          <w:sz w:val="2"/>
-        </w:rPr>
-        <w:t/>
-      </w:r>
     </w:p>
     <w:tbl>
       <w:tblPr>
+        <w:tblStyle w:val="TableNormal"/>
         <w:tblW w:w="8671" w:type="dxa"/>
         <w:jc w:val="center"/>
         <w:tblBorders>
@@ -691,11 +679,7 @@
           <w:insideV w:val="nil"/>
         </w:tblBorders>
         <w:tblLayout w:type="fixed"/>
-        <w:tblCellMar>
-          <w:left w:w="0" w:type="dxa"/>
-          <w:right w:w="0" w:type="dxa"/>
-        </w:tblCellMar>
-        <w:tblLook w:val="0000"/>
+        <w:tblLook w:val="0000" w:firstRow="0" w:lastRow="0" w:firstColumn="0" w:lastColumn="0" w:noHBand="0" w:noVBand="0"/>
       </w:tblPr>
       <w:tblGrid>
         <w:gridCol w:w="8671"/>
@@ -703,6 +687,7 @@
       <w:tr>
         <w:trPr>
           <w:cantSplit/>
+          <w:jc w:val="center"/>
         </w:trPr>
         <w:tc>
           <w:tcPr>
@@ -723,7 +708,6 @@
           </w:tcPr>
           <w:p>
             <w:pPr>
-              <w:spacing w:before="0" w:after="0" w:line="240" w:lineRule="auto"/>
               <w:jc w:val="center"/>
             </w:pPr>
             <w:r>
@@ -735,9 +719,8 @@
                 <w:spacing w:val="20"/>
                 <w:sz w:val="84"/>
                 <w:szCs w:val="84"/>
-                <w:lang w:val="fr-FR"/>
-              </w:rPr>
-              <w:t xml:space="preserve">Qribna</w:t>
+              </w:rPr>
+              <w:t>Reparé’Lik</w:t>
             </w:r>
           </w:p>
           <w:p>
@@ -745,19 +728,13 @@
               <w:pBdr>
                 <w:bottom w:val="single" w:sz="24" w:space="1" w:color="7A0039"/>
               </w:pBdr>
-              <w:spacing w:before="0" w:after="0" w:line="120" w:lineRule="exact"/>
+              <w:spacing w:line="120" w:lineRule="exact"/>
               <w:ind w:left="3535" w:right="3535"/>
             </w:pPr>
-            <w:r>
-              <w:rPr>
-                <w:sz w:val="2"/>
-              </w:rPr>
-              <w:t/>
-            </w:r>
           </w:p>
           <w:p>
             <w:pPr>
-              <w:spacing w:before="240" w:after="0" w:line="240" w:lineRule="auto"/>
+              <w:spacing w:before="240"/>
               <w:jc w:val="center"/>
             </w:pPr>
             <w:r>
@@ -768,14 +745,13 @@
                 <w:color w:val="6B6B6B"/>
                 <w:sz w:val="26"/>
                 <w:szCs w:val="26"/>
-                <w:lang w:val="fr-FR"/>
-              </w:rPr>
-              <w:t xml:space="preserve">Plateforme de gestion et de recherche de boutiques</w:t>
+              </w:rPr>
+              <w:t>Plateforme de gestion et de recherche de boutiques</w:t>
             </w:r>
           </w:p>
           <w:p>
             <w:pPr>
-              <w:spacing w:before="20" w:after="0" w:line="240" w:lineRule="auto"/>
+              <w:spacing w:before="20"/>
               <w:jc w:val="center"/>
             </w:pPr>
             <w:r>
@@ -786,9 +762,8 @@
                 <w:color w:val="6B6B6B"/>
                 <w:sz w:val="26"/>
                 <w:szCs w:val="26"/>
-                <w:lang w:val="fr-FR"/>
-              </w:rPr>
-              <w:t xml:space="preserve">de réparation de téléphones au Maroc</w:t>
+              </w:rPr>
+              <w:t>de réparation de téléphones au Maroc</w:t>
             </w:r>
           </w:p>
         </w:tc>
@@ -796,17 +771,12 @@
     </w:tbl>
     <w:p>
       <w:pPr>
-        <w:spacing w:before="0" w:after="0" w:line="240" w:lineRule="exact"/>
+        <w:spacing w:line="240" w:lineRule="exact"/>
       </w:pPr>
-      <w:r>
-        <w:rPr>
-          <w:sz w:val="2"/>
-        </w:rPr>
-        <w:t/>
-      </w:r>
     </w:p>
     <w:tbl>
       <w:tblPr>
+        <w:tblStyle w:val="TableNormal"/>
         <w:tblW w:w="8671" w:type="dxa"/>
         <w:jc w:val="center"/>
         <w:tblBorders>
@@ -818,11 +788,7 @@
           <w:insideV w:val="nil"/>
         </w:tblBorders>
         <w:tblLayout w:type="fixed"/>
-        <w:tblCellMar>
-          <w:left w:w="0" w:type="dxa"/>
-          <w:right w:w="0" w:type="dxa"/>
-        </w:tblCellMar>
-        <w:tblLook w:val="0000"/>
+        <w:tblLook w:val="0000" w:firstRow="0" w:lastRow="0" w:firstColumn="0" w:lastColumn="0" w:noHBand="0" w:noVBand="0"/>
       </w:tblPr>
       <w:tblGrid>
         <w:gridCol w:w="2890"/>
@@ -832,6 +798,7 @@
       <w:tr>
         <w:trPr>
           <w:cantSplit/>
+          <w:jc w:val="center"/>
         </w:trPr>
         <w:tc>
           <w:tcPr>
@@ -852,7 +819,7 @@
           </w:tcPr>
           <w:p>
             <w:pPr>
-              <w:spacing w:before="0" w:after="40" w:line="240" w:lineRule="auto"/>
+              <w:spacing w:after="40"/>
               <w:jc w:val="center"/>
             </w:pPr>
             <w:r>
@@ -864,14 +831,12 @@
                 <w:spacing w:val="30"/>
                 <w:sz w:val="15"/>
                 <w:szCs w:val="15"/>
-                <w:lang w:val="fr-FR"/>
-              </w:rPr>
-              <w:t xml:space="preserve">MODULE</w:t>
+              </w:rPr>
+              <w:t>MODULE</w:t>
             </w:r>
           </w:p>
           <w:p>
             <w:pPr>
-              <w:spacing w:before="0" w:after="0" w:line="240" w:lineRule="auto"/>
               <w:jc w:val="center"/>
             </w:pPr>
             <w:r>
@@ -880,11 +845,8 @@
                 <w:b/>
                 <w:bCs/>
                 <w:color w:val="1F1F1F"/>
-                <w:sz w:val="22"/>
-                <w:szCs w:val="22"/>
-                <w:lang w:val="fr-FR"/>
-              </w:rPr>
-              <w:t xml:space="preserve">Génie logiciel</w:t>
+              </w:rPr>
+              <w:t>Génie logiciel</w:t>
             </w:r>
           </w:p>
         </w:tc>
@@ -907,7 +869,7 @@
           </w:tcPr>
           <w:p>
             <w:pPr>
-              <w:spacing w:before="0" w:after="40" w:line="240" w:lineRule="auto"/>
+              <w:spacing w:after="40"/>
               <w:jc w:val="center"/>
             </w:pPr>
             <w:r>
@@ -919,14 +881,12 @@
                 <w:spacing w:val="30"/>
                 <w:sz w:val="15"/>
                 <w:szCs w:val="15"/>
-                <w:lang w:val="fr-FR"/>
-              </w:rPr>
-              <w:t xml:space="preserve">DATE</w:t>
+              </w:rPr>
+              <w:t>DATE</w:t>
             </w:r>
           </w:p>
           <w:p>
             <w:pPr>
-              <w:spacing w:before="0" w:after="0" w:line="240" w:lineRule="auto"/>
               <w:jc w:val="center"/>
             </w:pPr>
             <w:r>
@@ -935,11 +895,8 @@
                 <w:b/>
                 <w:bCs/>
                 <w:color w:val="1F1F1F"/>
-                <w:sz w:val="22"/>
-                <w:szCs w:val="22"/>
-                <w:lang w:val="fr-FR"/>
-              </w:rPr>
-              <w:t xml:space="preserve">15 octobre 2026</w:t>
+              </w:rPr>
+              <w:t>15 octobre 2026</w:t>
             </w:r>
           </w:p>
         </w:tc>
@@ -962,7 +919,7 @@
           </w:tcPr>
           <w:p>
             <w:pPr>
-              <w:spacing w:before="0" w:after="40" w:line="240" w:lineRule="auto"/>
+              <w:spacing w:after="40"/>
               <w:jc w:val="center"/>
             </w:pPr>
             <w:r>
@@ -974,14 +931,12 @@
                 <w:spacing w:val="30"/>
                 <w:sz w:val="15"/>
                 <w:szCs w:val="15"/>
-                <w:lang w:val="fr-FR"/>
-              </w:rPr>
-              <w:t xml:space="preserve">ANNÉE UNIVERSITAIRE</w:t>
+              </w:rPr>
+              <w:t>ANNÉE UNIVERSITAIRE</w:t>
             </w:r>
           </w:p>
           <w:p>
             <w:pPr>
-              <w:spacing w:before="0" w:after="0" w:line="240" w:lineRule="auto"/>
               <w:jc w:val="center"/>
             </w:pPr>
             <w:r>
@@ -990,11 +945,8 @@
                 <w:b/>
                 <w:bCs/>
                 <w:color w:val="1F1F1F"/>
-                <w:sz w:val="22"/>
-                <w:szCs w:val="22"/>
-                <w:lang w:val="fr-FR"/>
-              </w:rPr>
-              <w:t xml:space="preserve">2026/2027</w:t>
+              </w:rPr>
+              <w:t>2026/2027</w:t>
             </w:r>
           </w:p>
         </w:tc>
@@ -1002,108 +954,132 @@
     </w:tbl>
     <w:p>
       <w:pPr>
-        <w:spacing w:before="0" w:after="0" w:line="1100" w:lineRule="exact"/>
+        <w:spacing w:line="1100" w:lineRule="exact"/>
       </w:pPr>
       <w:r>
-        <w:drawing>
-          <wp:anchor distT="0" distB="0" distL="0" distR="0" simplePos="0" relativeHeight="487550000" behindDoc="1" locked="0" layoutInCell="1" allowOverlap="1">
-            <wp:simplePos x="0" y="0"/>
-            <wp:positionH relativeFrom="margin">
-              <wp:align>center</wp:align>
-            </wp:positionH>
-            <wp:positionV relativeFrom="paragraph">
-              <wp:posOffset>698500</wp:posOffset>
-            </wp:positionV>
-            <wp:extent cx="5506085" cy="1611630"/>
-            <wp:effectExtent l="0" t="0" r="0" b="0"/>
-            <wp:wrapNone/>
-            <wp:docPr id="102" name="Carte"/>
-            <wp:cNvGraphicFramePr/>
-            <a:graphic>
-              <a:graphicData uri="http://schemas.microsoft.com/office/word/2010/wordprocessingShape">
-                <wps:wsp>
-                  <wps:cNvSpPr/>
-                  <wps:spPr>
-                    <a:xfrm>
-                      <a:off x="0" y="0"/>
-                      <a:ext cx="5506085" cy="1611630"/>
-                    </a:xfrm>
-                    <a:prstGeom prst="roundRect">
-                      <a:avLst>
-                        <a:gd name="adj" fmla="val 7445"/>
-                      </a:avLst>
-                    </a:prstGeom>
-                    <a:solidFill>
-                      <a:srgbClr val="FFFFFF"/>
-                    </a:solidFill>
-                    <a:ln w="9525">
-                      <a:solidFill>
-                        <a:srgbClr val="D0D0D0"/>
-                      </a:solidFill>
-                    </a:ln>
-                  </wps:spPr>
-                  <wps:bodyPr/>
-                </wps:wsp>
-              </a:graphicData>
-            </a:graphic>
-          </wp:anchor>
-        </w:drawing>
-      </w:r>
-      <w:r>
-        <w:drawing>
-          <wp:anchor distT="0" distB="0" distL="0" distR="0" simplePos="0" relativeHeight="487550100" behindDoc="1" locked="0" layoutInCell="1" allowOverlap="1">
-            <wp:simplePos x="0" y="0"/>
-            <wp:positionH relativeFrom="margin">
-              <wp:align>center</wp:align>
-            </wp:positionH>
-            <wp:positionV relativeFrom="paragraph">
-              <wp:posOffset>698500</wp:posOffset>
-            </wp:positionV>
-            <wp:extent cx="5506085" cy="297180"/>
-            <wp:effectExtent l="0" t="0" r="0" b="0"/>
-            <wp:wrapNone/>
-            <wp:docPr id="103" name="Bandeau carte"/>
-            <wp:cNvGraphicFramePr/>
-            <a:graphic>
-              <a:graphicData uri="http://schemas.microsoft.com/office/word/2010/wordprocessingShape">
-                <wps:wsp>
-                  <wps:cNvSpPr/>
-                  <wps:spPr>
-                    <a:xfrm>
-                      <a:off x="0" y="0"/>
-                      <a:ext cx="5506085" cy="297180"/>
-                    </a:xfrm>
-                    <a:prstGeom prst="round2SameRect">
-                      <a:avLst>
-                        <a:gd name="adj1" fmla="val 40379"/>
-                        <a:gd name="adj2" fmla="val 0"/>
-                      </a:avLst>
-                    </a:prstGeom>
-                    <a:solidFill>
-                      <a:srgbClr val="F2F2F2"/>
-                    </a:solidFill>
-                    <a:ln w="9525">
-                      <a:solidFill>
-                        <a:srgbClr val="D0D0D0"/>
-                      </a:solidFill>
-                    </a:ln>
-                  </wps:spPr>
-                  <wps:bodyPr/>
-                </wps:wsp>
-              </a:graphicData>
-            </a:graphic>
-          </wp:anchor>
-        </w:drawing>
-      </w:r>
-      <w:r>
-        <w:rPr>
-          <w:sz w:val="2"/>
-        </w:rPr>
-        <w:t/>
+        <w:rPr>
+          <w:noProof/>
+        </w:rPr>
+        <mc:AlternateContent>
+          <mc:Choice Requires="wps">
+            <w:drawing>
+              <wp:anchor distT="0" distB="0" distL="0" distR="0" simplePos="0" relativeHeight="487550000" behindDoc="1" locked="0" layoutInCell="1" allowOverlap="1" wp14:anchorId="34D281CF" wp14:editId="0ACAAF61">
+                <wp:simplePos x="0" y="0"/>
+                <wp:positionH relativeFrom="margin">
+                  <wp:align>center</wp:align>
+                </wp:positionH>
+                <wp:positionV relativeFrom="paragraph">
+                  <wp:posOffset>698500</wp:posOffset>
+                </wp:positionV>
+                <wp:extent cx="5506085" cy="1611630"/>
+                <wp:effectExtent l="0" t="0" r="0" b="0"/>
+                <wp:wrapNone/>
+                <wp:docPr id="102" name="Carte"/>
+                <wp:cNvGraphicFramePr/>
+                <a:graphic xmlns:a="http://schemas.openxmlformats.org/drawingml/2006/main">
+                  <a:graphicData uri="http://schemas.microsoft.com/office/word/2010/wordprocessingShape">
+                    <wps:wsp>
+                      <wps:cNvSpPr/>
+                      <wps:spPr>
+                        <a:xfrm>
+                          <a:off x="0" y="0"/>
+                          <a:ext cx="5506085" cy="1611630"/>
+                        </a:xfrm>
+                        <a:prstGeom prst="roundRect">
+                          <a:avLst>
+                            <a:gd name="adj" fmla="val 7445"/>
+                          </a:avLst>
+                        </a:prstGeom>
+                        <a:solidFill>
+                          <a:srgbClr val="FFFFFF"/>
+                        </a:solidFill>
+                        <a:ln w="9525">
+                          <a:solidFill>
+                            <a:srgbClr val="D0D0D0"/>
+                          </a:solidFill>
+                        </a:ln>
+                      </wps:spPr>
+                      <wps:bodyPr/>
+                    </wps:wsp>
+                  </a:graphicData>
+                </a:graphic>
+              </wp:anchor>
+            </w:drawing>
+          </mc:Choice>
+          <mc:Fallback>
+            <w:pict>
+              <v:roundrect w14:anchorId="1DD6301E" id="Carte" o:spid="_x0000_s1026" style="position:absolute;margin-left:0;margin-top:55pt;width:433.55pt;height:126.9pt;z-index:-15766480;visibility:visible;mso-wrap-style:square;mso-wrap-distance-left:0;mso-wrap-distance-top:0;mso-wrap-distance-right:0;mso-wrap-distance-bottom:0;mso-position-horizontal:center;mso-position-horizontal-relative:margin;mso-position-vertical:absolute;mso-position-vertical-relative:text;v-text-anchor:top" arcsize="4879f" o:gfxdata="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" strokecolor="#d0d0d0">
+                <w10:wrap anchorx="margin"/>
+              </v:roundrect>
+            </w:pict>
+          </mc:Fallback>
+        </mc:AlternateContent>
+      </w:r>
+      <w:r>
+        <w:rPr>
+          <w:noProof/>
+        </w:rPr>
+        <mc:AlternateContent>
+          <mc:Choice Requires="wps">
+            <w:drawing>
+              <wp:anchor distT="0" distB="0" distL="0" distR="0" simplePos="0" relativeHeight="487550100" behindDoc="1" locked="0" layoutInCell="1" allowOverlap="1" wp14:anchorId="1CB6D32A" wp14:editId="2CCFAB34">
+                <wp:simplePos x="0" y="0"/>
+                <wp:positionH relativeFrom="margin">
+                  <wp:align>center</wp:align>
+                </wp:positionH>
+                <wp:positionV relativeFrom="paragraph">
+                  <wp:posOffset>698500</wp:posOffset>
+                </wp:positionV>
+                <wp:extent cx="5506085" cy="297180"/>
+                <wp:effectExtent l="0" t="0" r="0" b="0"/>
+                <wp:wrapNone/>
+                <wp:docPr id="103" name="Bandeau carte"/>
+                <wp:cNvGraphicFramePr/>
+                <a:graphic xmlns:a="http://schemas.openxmlformats.org/drawingml/2006/main">
+                  <a:graphicData uri="http://schemas.microsoft.com/office/word/2010/wordprocessingShape">
+                    <wps:wsp>
+                      <wps:cNvSpPr/>
+                      <wps:spPr>
+                        <a:xfrm>
+                          <a:off x="0" y="0"/>
+                          <a:ext cx="5506085" cy="297180"/>
+                        </a:xfrm>
+                        <a:prstGeom prst="round2SameRect">
+                          <a:avLst>
+                            <a:gd name="adj1" fmla="val 40379"/>
+                            <a:gd name="adj2" fmla="val 0"/>
+                          </a:avLst>
+                        </a:prstGeom>
+                        <a:solidFill>
+                          <a:srgbClr val="F2F2F2"/>
+                        </a:solidFill>
+                        <a:ln w="9525">
+                          <a:solidFill>
+                            <a:srgbClr val="D0D0D0"/>
+                          </a:solidFill>
+                        </a:ln>
+                      </wps:spPr>
+                      <wps:bodyPr/>
+                    </wps:wsp>
+                  </a:graphicData>
+                </a:graphic>
+              </wp:anchor>
+            </w:drawing>
+          </mc:Choice>
+          <mc:Fallback>
+            <w:pict>
+              <v:shape w14:anchorId="16ED5C59" id="Bandeau carte" o:spid="_x0000_s1026" style="position:absolute;margin-left:0;margin-top:55pt;width:433.55pt;height:23.4pt;z-index:-15766380;visibility:visible;mso-wrap-style:square;mso-wrap-distance-left:0;mso-wrap-distance-top:0;mso-wrap-distance-right:0;mso-wrap-distance-bottom:0;mso-position-horizontal:center;mso-position-horizontal-relative:margin;mso-position-vertical:absolute;mso-position-vertical-relative:text;v-text-anchor:top" coordsize="5506085,297180" o:gfxdata="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" path="m119998,l5386087,v66273,,119998,53725,119998,119998l5506085,297180r,l,297180r,l,119998c,53725,53725,,119998,xe" fillcolor="#f2f2f2" strokecolor="#d0d0d0">
+                <v:path arrowok="t" o:connecttype="custom" o:connectlocs="119998,0;5386087,0;5506085,119998;5506085,297180;5506085,297180;0,297180;0,297180;0,119998;119998,0" o:connectangles="0,0,0,0,0,0,0,0,0"/>
+                <w10:wrap anchorx="margin"/>
+              </v:shape>
+            </w:pict>
+          </mc:Fallback>
+        </mc:AlternateContent>
       </w:r>
     </w:p>
     <w:tbl>
       <w:tblPr>
+        <w:tblStyle w:val="TableNormal"/>
         <w:tblW w:w="8671" w:type="dxa"/>
         <w:jc w:val="center"/>
         <w:tblBorders>
@@ -1115,11 +1091,7 @@
           <w:insideV w:val="nil"/>
         </w:tblBorders>
         <w:tblLayout w:type="fixed"/>
-        <w:tblCellMar>
-          <w:left w:w="0" w:type="dxa"/>
-          <w:right w:w="0" w:type="dxa"/>
-        </w:tblCellMar>
-        <w:tblLook w:val="0000"/>
+        <w:tblLook w:val="0000" w:firstRow="0" w:lastRow="0" w:firstColumn="0" w:lastColumn="0" w:noHBand="0" w:noVBand="0"/>
       </w:tblPr>
       <w:tblGrid>
         <w:gridCol w:w="5000"/>
@@ -1128,6 +1100,7 @@
       <w:tr>
         <w:trPr>
           <w:cantSplit/>
+          <w:jc w:val="center"/>
         </w:trPr>
         <w:tc>
           <w:tcPr>
@@ -1147,10 +1120,6 @@
             <w:vAlign w:val="center"/>
           </w:tcPr>
           <w:p>
-            <w:pPr>
-              <w:spacing w:before="0" w:after="0" w:line="240" w:lineRule="auto"/>
-              <w:jc w:val="left"/>
-            </w:pPr>
             <w:r>
               <w:rPr>
                 <w:rFonts w:ascii="Cambria" w:hAnsi="Cambria" w:cs="Cambria"/>
@@ -1160,9 +1129,8 @@
                 <w:spacing w:val="40"/>
                 <w:sz w:val="17"/>
                 <w:szCs w:val="17"/>
-                <w:lang w:val="fr-FR"/>
-              </w:rPr>
-              <w:t xml:space="preserve">RÉALISÉ PAR</w:t>
+              </w:rPr>
+              <w:t>RÉALISÉ PAR</w:t>
             </w:r>
           </w:p>
         </w:tc>
@@ -1184,10 +1152,6 @@
             <w:vAlign w:val="center"/>
           </w:tcPr>
           <w:p>
-            <w:pPr>
-              <w:spacing w:before="0" w:after="0" w:line="240" w:lineRule="auto"/>
-              <w:jc w:val="left"/>
-            </w:pPr>
             <w:r>
               <w:rPr>
                 <w:rFonts w:ascii="Cambria" w:hAnsi="Cambria" w:cs="Cambria"/>
@@ -1197,9 +1161,8 @@
                 <w:spacing w:val="40"/>
                 <w:sz w:val="17"/>
                 <w:szCs w:val="17"/>
-                <w:lang w:val="fr-FR"/>
-              </w:rPr>
-              <w:t xml:space="preserve">ENCADRÉ PAR</w:t>
+              </w:rPr>
+              <w:t>ENCADRÉ PAR</w:t>
             </w:r>
           </w:p>
         </w:tc>
@@ -1207,6 +1170,7 @@
       <w:tr>
         <w:trPr>
           <w:cantSplit/>
+          <w:jc w:val="center"/>
         </w:trPr>
         <w:tc>
           <w:tcPr>
@@ -1224,25 +1188,20 @@
               <w:bottom w:w="160" w:type="dxa"/>
               <w:right w:w="240" w:type="dxa"/>
             </w:tcMar>
-            <w:vAlign w:val="top"/>
           </w:tcPr>
           <w:p>
             <w:pPr>
               <w:tabs>
                 <w:tab w:val="left" w:pos="700"/>
               </w:tabs>
-              <w:spacing w:before="0" w:after="80" w:line="240" w:lineRule="auto"/>
-              <w:jc w:val="left"/>
+              <w:spacing w:after="80"/>
             </w:pPr>
             <w:r>
               <w:rPr>
                 <w:rFonts w:ascii="Cambria" w:hAnsi="Cambria" w:cs="Cambria"/>
                 <w:color w:val="6B6B6B"/>
-                <w:sz w:val="22"/>
-                <w:szCs w:val="22"/>
-                <w:lang w:val="fr-FR"/>
-              </w:rPr>
-              <w:t xml:space="preserve">M.</w:t>
+              </w:rPr>
+              <w:t>M.</w:t>
             </w:r>
             <w:r>
               <w:tab/>
@@ -1253,9 +1212,6 @@
                 <w:b/>
                 <w:bCs/>
                 <w:color w:val="1F1F1F"/>
-                <w:sz w:val="22"/>
-                <w:szCs w:val="22"/>
-                <w:lang w:val="fr-FR"/>
               </w:rPr>
               <w:t xml:space="preserve">KADADE MAHAMADOU </w:t>
             </w:r>
@@ -1263,11 +1219,8 @@
               <w:rPr>
                 <w:rFonts w:ascii="Cambria" w:hAnsi="Cambria" w:cs="Cambria"/>
                 <w:color w:val="1F1F1F"/>
-                <w:sz w:val="22"/>
-                <w:szCs w:val="22"/>
-                <w:lang w:val="fr-FR"/>
-              </w:rPr>
-              <w:t xml:space="preserve">Bassirou</w:t>
+              </w:rPr>
+              <w:t>Bassirou</w:t>
             </w:r>
           </w:p>
           <w:p>
@@ -1275,18 +1228,14 @@
               <w:tabs>
                 <w:tab w:val="left" w:pos="700"/>
               </w:tabs>
-              <w:spacing w:before="0" w:after="80" w:line="240" w:lineRule="auto"/>
-              <w:jc w:val="left"/>
+              <w:spacing w:after="80"/>
             </w:pPr>
             <w:r>
               <w:rPr>
                 <w:rFonts w:ascii="Cambria" w:hAnsi="Cambria" w:cs="Cambria"/>
                 <w:color w:val="6B6B6B"/>
-                <w:sz w:val="22"/>
-                <w:szCs w:val="22"/>
-                <w:lang w:val="fr-FR"/>
-              </w:rPr>
-              <w:t xml:space="preserve">Mme</w:t>
+              </w:rPr>
+              <w:t>Mme</w:t>
             </w:r>
             <w:r>
               <w:tab/>
@@ -1297,9 +1246,6 @@
                 <w:b/>
                 <w:bCs/>
                 <w:color w:val="1F1F1F"/>
-                <w:sz w:val="22"/>
-                <w:szCs w:val="22"/>
-                <w:lang w:val="fr-FR"/>
               </w:rPr>
               <w:t xml:space="preserve">DAROUICHE </w:t>
             </w:r>
@@ -1307,11 +1253,8 @@
               <w:rPr>
                 <w:rFonts w:ascii="Cambria" w:hAnsi="Cambria" w:cs="Cambria"/>
                 <w:color w:val="1F1F1F"/>
-                <w:sz w:val="22"/>
-                <w:szCs w:val="22"/>
-                <w:lang w:val="fr-FR"/>
-              </w:rPr>
-              <w:t xml:space="preserve">Chaimae</w:t>
+              </w:rPr>
+              <w:t>Chaimae</w:t>
             </w:r>
           </w:p>
           <w:p>
@@ -1319,18 +1262,14 @@
               <w:tabs>
                 <w:tab w:val="left" w:pos="700"/>
               </w:tabs>
-              <w:spacing w:before="0" w:after="80" w:line="240" w:lineRule="auto"/>
-              <w:jc w:val="left"/>
+              <w:spacing w:after="80"/>
             </w:pPr>
             <w:r>
               <w:rPr>
                 <w:rFonts w:ascii="Cambria" w:hAnsi="Cambria" w:cs="Cambria"/>
                 <w:color w:val="6B6B6B"/>
-                <w:sz w:val="22"/>
-                <w:szCs w:val="22"/>
-                <w:lang w:val="fr-FR"/>
-              </w:rPr>
-              <w:t xml:space="preserve">Mme</w:t>
+              </w:rPr>
+              <w:t>Mme</w:t>
             </w:r>
             <w:r>
               <w:tab/>
@@ -1341,9 +1280,6 @@
                 <w:b/>
                 <w:bCs/>
                 <w:color w:val="1F1F1F"/>
-                <w:sz w:val="22"/>
-                <w:szCs w:val="22"/>
-                <w:lang w:val="fr-FR"/>
               </w:rPr>
               <w:t xml:space="preserve">EL MENOUALI </w:t>
             </w:r>
@@ -1351,11 +1287,8 @@
               <w:rPr>
                 <w:rFonts w:ascii="Cambria" w:hAnsi="Cambria" w:cs="Cambria"/>
                 <w:color w:val="1F1F1F"/>
-                <w:sz w:val="22"/>
-                <w:szCs w:val="22"/>
-                <w:lang w:val="fr-FR"/>
-              </w:rPr>
-              <w:t xml:space="preserve">Aya</w:t>
+              </w:rPr>
+              <w:t>Aya</w:t>
             </w:r>
           </w:p>
           <w:p>
@@ -1363,18 +1296,14 @@
               <w:tabs>
                 <w:tab w:val="left" w:pos="700"/>
               </w:tabs>
-              <w:spacing w:before="0" w:after="80" w:line="240" w:lineRule="auto"/>
-              <w:jc w:val="left"/>
+              <w:spacing w:after="80"/>
             </w:pPr>
             <w:r>
               <w:rPr>
                 <w:rFonts w:ascii="Cambria" w:hAnsi="Cambria" w:cs="Cambria"/>
                 <w:color w:val="6B6B6B"/>
-                <w:sz w:val="22"/>
-                <w:szCs w:val="22"/>
-                <w:lang w:val="fr-FR"/>
-              </w:rPr>
-              <w:t xml:space="preserve">M.</w:t>
+              </w:rPr>
+              <w:t>M.</w:t>
             </w:r>
             <w:r>
               <w:tab/>
@@ -1385,9 +1314,6 @@
                 <w:b/>
                 <w:bCs/>
                 <w:color w:val="1F1F1F"/>
-                <w:sz w:val="22"/>
-                <w:szCs w:val="22"/>
-                <w:lang w:val="fr-FR"/>
               </w:rPr>
               <w:t xml:space="preserve">DIALLO </w:t>
             </w:r>
@@ -1395,11 +1321,8 @@
               <w:rPr>
                 <w:rFonts w:ascii="Cambria" w:hAnsi="Cambria" w:cs="Cambria"/>
                 <w:color w:val="1F1F1F"/>
-                <w:sz w:val="22"/>
-                <w:szCs w:val="22"/>
-                <w:lang w:val="fr-FR"/>
-              </w:rPr>
-              <w:t xml:space="preserve">Ahmadou Siradiou</w:t>
+              </w:rPr>
+              <w:t>Ahmadou Siradiou</w:t>
             </w:r>
           </w:p>
           <w:p>
@@ -1407,18 +1330,14 @@
               <w:tabs>
                 <w:tab w:val="left" w:pos="700"/>
               </w:tabs>
-              <w:spacing w:before="0" w:after="80" w:line="240" w:lineRule="auto"/>
-              <w:jc w:val="left"/>
+              <w:spacing w:after="80"/>
             </w:pPr>
             <w:r>
               <w:rPr>
                 <w:rFonts w:ascii="Cambria" w:hAnsi="Cambria" w:cs="Cambria"/>
                 <w:color w:val="6B6B6B"/>
-                <w:sz w:val="22"/>
-                <w:szCs w:val="22"/>
-                <w:lang w:val="fr-FR"/>
-              </w:rPr>
-              <w:t xml:space="preserve">Mme</w:t>
+              </w:rPr>
+              <w:t>Mme</w:t>
             </w:r>
             <w:r>
               <w:tab/>
@@ -1429,9 +1348,6 @@
                 <w:b/>
                 <w:bCs/>
                 <w:color w:val="1F1F1F"/>
-                <w:sz w:val="22"/>
-                <w:szCs w:val="22"/>
-                <w:lang w:val="fr-FR"/>
               </w:rPr>
               <w:t xml:space="preserve">CHKOUBI </w:t>
             </w:r>
@@ -1439,11 +1355,8 @@
               <w:rPr>
                 <w:rFonts w:ascii="Cambria" w:hAnsi="Cambria" w:cs="Cambria"/>
                 <w:color w:val="1F1F1F"/>
-                <w:sz w:val="22"/>
-                <w:szCs w:val="22"/>
-                <w:lang w:val="fr-FR"/>
-              </w:rPr>
-              <w:t xml:space="preserve">Salma</w:t>
+              </w:rPr>
+              <w:t>Salma</w:t>
             </w:r>
           </w:p>
         </w:tc>
@@ -1462,25 +1375,19 @@
               <w:bottom w:w="160" w:type="dxa"/>
               <w:right w:w="240" w:type="dxa"/>
             </w:tcMar>
-            <w:vAlign w:val="top"/>
           </w:tcPr>
           <w:p>
             <w:pPr>
               <w:tabs>
                 <w:tab w:val="left" w:pos="700"/>
               </w:tabs>
-              <w:spacing w:before="0" w:after="0" w:line="240" w:lineRule="auto"/>
-              <w:jc w:val="left"/>
             </w:pPr>
             <w:r>
               <w:rPr>
                 <w:rFonts w:ascii="Cambria" w:hAnsi="Cambria" w:cs="Cambria"/>
                 <w:color w:val="6B6B6B"/>
-                <w:sz w:val="22"/>
-                <w:szCs w:val="22"/>
-                <w:lang w:val="fr-FR"/>
-              </w:rPr>
-              <w:t xml:space="preserve">Mme</w:t>
+              </w:rPr>
+              <w:t>Mme</w:t>
             </w:r>
             <w:r>
               <w:tab/>
@@ -1491,21 +1398,8 @@
                 <w:b/>
                 <w:bCs/>
                 <w:color w:val="1F1F1F"/>
-                <w:sz w:val="22"/>
-                <w:szCs w:val="22"/>
-                <w:lang w:val="fr-FR"/>
-              </w:rPr>
-              <w:t xml:space="preserve">RADGUI</w:t>
-            </w:r>
-            <w:r>
-              <w:rPr>
-                <w:rFonts w:ascii="Cambria" w:hAnsi="Cambria" w:cs="Cambria"/>
-                <w:color w:val="1F1F1F"/>
-                <w:sz w:val="22"/>
-                <w:szCs w:val="22"/>
-                <w:lang w:val="fr-FR"/>
-              </w:rPr>
-              <w:t xml:space="preserve"/>
+              </w:rPr>
+              <w:t>RADGUI</w:t>
             </w:r>
           </w:p>
         </w:tc>
@@ -1513,6 +1407,7 @@
       <w:tr>
         <w:trPr>
           <w:cantSplit/>
+          <w:jc w:val="center"/>
         </w:trPr>
         <w:tc>
           <w:tcPr>
@@ -1530,7 +1425,6 @@
               <w:bottom w:w="160" w:type="dxa"/>
               <w:right w:w="240" w:type="dxa"/>
             </w:tcMar>
-            <w:vAlign w:val="top"/>
           </w:tcPr>
           <w:p/>
         </w:tc>
@@ -1549,13 +1443,8 @@
               <w:bottom w:w="160" w:type="dxa"/>
               <w:right w:w="240" w:type="dxa"/>
             </w:tcMar>
-            <w:vAlign w:val="top"/>
           </w:tcPr>
           <w:p>
-            <w:pPr>
-              <w:spacing w:before="0" w:after="0" w:line="240" w:lineRule="auto"/>
-              <w:jc w:val="left"/>
-            </w:pPr>
             <w:r>
               <w:rPr>
                 <w:rFonts w:ascii="Cambria" w:hAnsi="Cambria" w:cs="Cambria"/>
@@ -1565,15 +1454,13 @@
                 <w:spacing w:val="40"/>
                 <w:sz w:val="17"/>
                 <w:szCs w:val="17"/>
-                <w:lang w:val="fr-FR"/>
-              </w:rPr>
-              <w:t xml:space="preserve">FILIÈRES</w:t>
+              </w:rPr>
+              <w:t>FILIÈRES</w:t>
             </w:r>
           </w:p>
           <w:p>
             <w:pPr>
-              <w:spacing w:before="60" w:after="0" w:line="240" w:lineRule="auto"/>
-              <w:jc w:val="left"/>
+              <w:spacing w:before="60"/>
             </w:pPr>
             <w:r>
               <w:rPr>
@@ -1581,11 +1468,8 @@
                 <w:b/>
                 <w:bCs/>
                 <w:color w:val="1F1F1F"/>
-                <w:sz w:val="22"/>
-                <w:szCs w:val="22"/>
-                <w:lang w:val="fr-FR"/>
-              </w:rPr>
-              <w:t xml:space="preserve">DSE &amp; M2SI</w:t>
+              </w:rPr>
+              <w:t>DSE &amp; M2SI</w:t>
             </w:r>
           </w:p>
         </w:tc>
@@ -1593,33 +1477,28 @@
     </w:tbl>
     <w:p>
       <w:pPr>
-        <w:spacing w:before="0" w:after="0" w:line="120" w:lineRule="exact"/>
+        <w:spacing w:line="120" w:lineRule="exact"/>
       </w:pPr>
-      <w:r>
-        <w:rPr>
-          <w:sz w:val="2"/>
-        </w:rPr>
-        <w:t/>
-      </w:r>
     </w:p>
     <w:sectPr>
       <w:type w:val="continuous"/>
       <w:pgSz w:w="11930" w:h="16860"/>
-      <w:pgMar w:top="420" w:bottom="280" w:left="1559" w:right="1700"/>
+      <w:pgMar w:top="420" w:right="1700" w:bottom="280" w:left="1559" w:header="720" w:footer="720" w:gutter="0"/>
+      <w:cols w:space="720"/>
     </w:sectPr>
   </w:body>
 </w:document>
 </file>
 
 <file path=word/styles.xml><?xml version="1.0" encoding="utf-8"?>
-<w:styles xmlns:r="http://schemas.openxmlformats.org/officeDocument/2006/relationships" xmlns:w="http://schemas.openxmlformats.org/wordprocessingml/2006/main">
+<w:styles xmlns:mc="http://schemas.openxmlformats.org/markup-compatibility/2006" xmlns:r="http://schemas.openxmlformats.org/officeDocument/2006/relationships" xmlns:w="http://schemas.openxmlformats.org/wordprocessingml/2006/main" xmlns:w14="http://schemas.microsoft.com/office/word/2010/wordml" xmlns:w15="http://schemas.microsoft.com/office/word/2012/wordml" xmlns:w16cex="http://schemas.microsoft.com/office/word/2018/wordml/cex" xmlns:w16cid="http://schemas.microsoft.com/office/word/2016/wordml/cid" xmlns:w16="http://schemas.microsoft.com/office/word/2018/wordml" xmlns:w16du="http://schemas.microsoft.com/office/word/2023/wordml/word16du" xmlns:w16sdtdh="http://schemas.microsoft.com/office/word/2020/wordml/sdtdatahash" xmlns:w16sdtfl="http://schemas.microsoft.com/office/word/2024/wordml/sdtformatlock" xmlns:w16se="http://schemas.microsoft.com/office/word/2015/wordml/symex" mc:Ignorable="w14 w15 w16se w16cid w16 w16cex w16sdtdh w16sdtfl w16du">
   <w:docDefaults>
     <w:rPrDefault>
       <w:rPr>
-        <w:rFonts w:cstheme="minorBidi" w:hAnsiTheme="minorHAnsi" w:eastAsiaTheme="minorHAnsi" w:asciiTheme="minorHAnsi"/>
+        <w:rFonts w:asciiTheme="minorHAnsi" w:eastAsiaTheme="minorHAnsi" w:hAnsiTheme="minorHAnsi" w:cstheme="minorBidi"/>
         <w:sz w:val="22"/>
         <w:szCs w:val="22"/>
-        <w:lang w:val="en-US" w:bidi="ar-SA" w:eastAsia="en-US"/>
+        <w:lang w:val="en-US" w:eastAsia="en-US" w:bidi="ar-SA"/>
       </w:rPr>
     </w:rPrDefault>
     <w:pPrDefault>
@@ -1627,19 +1506,440 @@
         <w:widowControl w:val="0"/>
         <w:autoSpaceDE w:val="0"/>
         <w:autoSpaceDN w:val="0"/>
-        <w:spacing w:lineRule="auto" w:line="240" w:before="0" w:after="0"/>
-        <w:ind w:left="0" w:right="0"/>
-        <w:jc w:val="left"/>
       </w:pPr>
     </w:pPrDefault>
   </w:docDefaults>
-  <w:style w:styleId="DefaultParagraphFont" w:default="1" w:type="character">
+  <w:latentStyles w:defLockedState="0" w:defUIPriority="99" w:defSemiHidden="0" w:defUnhideWhenUsed="0" w:defQFormat="0" w:count="376">
+    <w:lsdException w:name="Normal" w:uiPriority="0" w:qFormat="1"/>
+    <w:lsdException w:name="heading 1" w:uiPriority="9" w:qFormat="1"/>
+    <w:lsdException w:name="heading 2" w:semiHidden="1" w:uiPriority="9" w:unhideWhenUsed="1" w:qFormat="1"/>
+    <w:lsdException w:name="heading 3" w:semiHidden="1" w:uiPriority="9" w:unhideWhenUsed="1" w:qFormat="1"/>
+    <w:lsdException w:name="heading 4" w:semiHidden="1" w:uiPriority="9" w:unhideWhenUsed="1" w:qFormat="1"/>
+    <w:lsdException w:name="heading 5" w:semiHidden="1" w:uiPriority="9" w:unhideWhenUsed="1" w:qFormat="1"/>
+    <w:lsdException w:name="heading 6" w:semiHidden="1" w:uiPriority="9" w:unhideWhenUsed="1" w:qFormat="1"/>
+    <w:lsdException w:name="heading 7" w:semiHidden="1" w:uiPriority="9" w:unhideWhenUsed="1" w:qFormat="1"/>
+    <w:lsdException w:name="heading 8" w:semiHidden="1" w:uiPriority="9" w:unhideWhenUsed="1" w:qFormat="1"/>
+    <w:lsdException w:name="heading 9" w:semiHidden="1" w:uiPriority="9" w:unhideWhenUsed="1" w:qFormat="1"/>
+    <w:lsdException w:name="index 1" w:semiHidden="1" w:unhideWhenUsed="1"/>
+    <w:lsdException w:name="index 2" w:semiHidden="1" w:unhideWhenUsed="1"/>
+    <w:lsdException w:name="index 3" w:semiHidden="1" w:unhideWhenUsed="1"/>
+    <w:lsdException w:name="index 4" w:semiHidden="1" w:unhideWhenUsed="1"/>
+    <w:lsdException w:name="index 5" w:semiHidden="1" w:unhideWhenUsed="1"/>
+    <w:lsdException w:name="index 6" w:semiHidden="1" w:unhideWhenUsed="1"/>
+    <w:lsdException w:name="index 7" w:semiHidden="1" w:unhideWhenUsed="1"/>
+    <w:lsdException w:name="index 8" w:semiHidden="1" w:unhideWhenUsed="1"/>
+    <w:lsdException w:name="index 9" w:semiHidden="1" w:unhideWhenUsed="1"/>
+    <w:lsdException w:name="toc 1" w:semiHidden="1" w:uiPriority="39" w:unhideWhenUsed="1"/>
+    <w:lsdException w:name="toc 2" w:semiHidden="1" w:uiPriority="39" w:unhideWhenUsed="1"/>
+    <w:lsdException w:name="toc 3" w:semiHidden="1" w:uiPriority="39" w:unhideWhenUsed="1"/>
+    <w:lsdException w:name="toc 4" w:semiHidden="1" w:uiPriority="39" w:unhideWhenUsed="1"/>
+    <w:lsdException w:name="toc 5" w:semiHidden="1" w:uiPriority="39" w:unhideWhenUsed="1"/>
+    <w:lsdException w:name="toc 6" w:semiHidden="1" w:uiPriority="39" w:unhideWhenUsed="1"/>
+    <w:lsdException w:name="toc 7" w:semiHidden="1" w:uiPriority="39" w:unhideWhenUsed="1"/>
+    <w:lsdException w:name="toc 8" w:semiHidden="1" w:uiPriority="39" w:unhideWhenUsed="1"/>
+    <w:lsdException w:name="toc 9" w:semiHidden="1" w:uiPriority="39" w:unhideWhenUsed="1"/>
+    <w:lsdException w:name="Normal Indent" w:semiHidden="1" w:unhideWhenUsed="1"/>
+    <w:lsdException w:name="footnote text" w:semiHidden="1" w:unhideWhenUsed="1"/>
+    <w:lsdException w:name="annotation text" w:semiHidden="1" w:unhideWhenUsed="1"/>
+    <w:lsdException w:name="header" w:semiHidden="1" w:unhideWhenUsed="1"/>
+    <w:lsdException w:name="footer" w:semiHidden="1" w:unhideWhenUsed="1"/>
+    <w:lsdException w:name="index heading" w:semiHidden="1" w:unhideWhenUsed="1"/>
+    <w:lsdException w:name="caption" w:semiHidden="1" w:uiPriority="35" w:unhideWhenUsed="1" w:qFormat="1"/>
+    <w:lsdException w:name="table of figures" w:semiHidden="1" w:unhideWhenUsed="1"/>
+    <w:lsdException w:name="envelope address" w:semiHidden="1" w:unhideWhenUsed="1"/>
+    <w:lsdException w:name="envelope return" w:semiHidden="1" w:unhideWhenUsed="1"/>
+    <w:lsdException w:name="footnote reference" w:semiHidden="1" w:unhideWhenUsed="1"/>
+    <w:lsdException w:name="annotation reference" w:semiHidden="1" w:unhideWhenUsed="1"/>
+    <w:lsdException w:name="line number" w:semiHidden="1" w:unhideWhenUsed="1"/>
+    <w:lsdException w:name="page number" w:semiHidden="1" w:unhideWhenUsed="1"/>
+    <w:lsdException w:name="endnote reference" w:semiHidden="1" w:unhideWhenUsed="1"/>
+    <w:lsdException w:name="endnote text" w:semiHidden="1" w:unhideWhenUsed="1"/>
+    <w:lsdException w:name="table of authorities" w:semiHidden="1" w:unhideWhenUsed="1"/>
+    <w:lsdException w:name="macro" w:semiHidden="1" w:unhideWhenUsed="1"/>
+    <w:lsdException w:name="toa heading" w:semiHidden="1" w:unhideWhenUsed="1"/>
+    <w:lsdException w:name="List" w:semiHidden="1" w:unhideWhenUsed="1"/>
+    <w:lsdException w:name="List Bullet" w:semiHidden="1" w:unhideWhenUsed="1"/>
+    <w:lsdException w:name="List Number" w:semiHidden="1" w:unhideWhenUsed="1"/>
+    <w:lsdException w:name="List 2" w:semiHidden="1" w:unhideWhenUsed="1"/>
+    <w:lsdException w:name="List 3" w:semiHidden="1" w:unhideWhenUsed="1"/>
+    <w:lsdException w:name="List 4" w:semiHidden="1" w:unhideWhenUsed="1"/>
+    <w:lsdException w:name="List 5" w:semiHidden="1" w:unhideWhenUsed="1"/>
+    <w:lsdException w:name="List Bullet 2" w:semiHidden="1" w:unhideWhenUsed="1"/>
+    <w:lsdException w:name="List Bullet 3" w:semiHidden="1" w:unhideWhenUsed="1"/>
+    <w:lsdException w:name="List Bullet 4" w:semiHidden="1" w:unhideWhenUsed="1"/>
+    <w:lsdException w:name="List Bullet 5" w:semiHidden="1" w:unhideWhenUsed="1"/>
+    <w:lsdException w:name="List Number 2" w:semiHidden="1" w:unhideWhenUsed="1"/>
+    <w:lsdException w:name="List Number 3" w:semiHidden="1" w:unhideWhenUsed="1"/>
+    <w:lsdException w:name="List Number 4" w:semiHidden="1" w:unhideWhenUsed="1"/>
+    <w:lsdException w:name="List Number 5" w:semiHidden="1" w:unhideWhenUsed="1"/>
+    <w:lsdException w:name="Title" w:uiPriority="10" w:qFormat="1"/>
+    <w:lsdException w:name="Closing" w:semiHidden="1" w:unhideWhenUsed="1"/>
+    <w:lsdException w:name="Signature" w:semiHidden="1" w:unhideWhenUsed="1"/>
+    <w:lsdException w:name="Default Paragraph Font" w:semiHidden="1" w:uiPriority="1" w:unhideWhenUsed="1"/>
+    <w:lsdException w:name="Body Text" w:semiHidden="1" w:unhideWhenUsed="1"/>
+    <w:lsdException w:name="Body Text Indent" w:semiHidden="1" w:unhideWhenUsed="1"/>
+    <w:lsdException w:name="List Continue" w:semiHidden="1" w:unhideWhenUsed="1"/>
+    <w:lsdException w:name="List Continue 2" w:semiHidden="1" w:unhideWhenUsed="1"/>
+    <w:lsdException w:name="List Continue 3" w:semiHidden="1" w:unhideWhenUsed="1"/>
+    <w:lsdException w:name="List Continue 4" w:semiHidden="1" w:unhideWhenUsed="1"/>
+    <w:lsdException w:name="List Continue 5" w:semiHidden="1" w:unhideWhenUsed="1"/>
+    <w:lsdException w:name="Message Header" w:semiHidden="1" w:unhideWhenUsed="1"/>
+    <w:lsdException w:name="Subtitle" w:uiPriority="11" w:qFormat="1"/>
+    <w:lsdException w:name="Salutation" w:semiHidden="1" w:unhideWhenUsed="1"/>
+    <w:lsdException w:name="Date" w:semiHidden="1" w:unhideWhenUsed="1"/>
+    <w:lsdException w:name="Body Text First Indent" w:semiHidden="1" w:unhideWhenUsed="1"/>
+    <w:lsdException w:name="Body Text First Indent 2" w:semiHidden="1" w:unhideWhenUsed="1"/>
+    <w:lsdException w:name="Note Heading" w:semiHidden="1" w:unhideWhenUsed="1"/>
+    <w:lsdException w:name="Body Text 2" w:semiHidden="1" w:unhideWhenUsed="1"/>
+    <w:lsdException w:name="Body Text 3" w:semiHidden="1" w:unhideWhenUsed="1"/>
+    <w:lsdException w:name="Body Text Indent 2" w:semiHidden="1" w:unhideWhenUsed="1"/>
+    <w:lsdException w:name="Body Text Indent 3" w:semiHidden="1" w:unhideWhenUsed="1"/>
+    <w:lsdException w:name="Block Text" w:semiHidden="1" w:unhideWhenUsed="1"/>
+    <w:lsdException w:name="Hyperlink" w:semiHidden="1" w:unhideWhenUsed="1"/>
+    <w:lsdException w:name="FollowedHyperlink" w:semiHidden="1" w:unhideWhenUsed="1"/>
+    <w:lsdException w:name="Strong" w:uiPriority="22" w:qFormat="1"/>
+    <w:lsdException w:name="Emphasis" w:uiPriority="20" w:qFormat="1"/>
+    <w:lsdException w:name="Document Map" w:semiHidden="1" w:unhideWhenUsed="1"/>
+    <w:lsdException w:name="Plain Text" w:semiHidden="1" w:unhideWhenUsed="1"/>
+    <w:lsdException w:name="E-mail Signature" w:semiHidden="1" w:unhideWhenUsed="1"/>
+    <w:lsdException w:name="HTML Top of Form" w:semiHidden="1" w:unhideWhenUsed="1"/>
+    <w:lsdException w:name="HTML Bottom of Form" w:semiHidden="1" w:unhideWhenUsed="1"/>
+    <w:lsdException w:name="Normal (Web)" w:semiHidden="1" w:unhideWhenUsed="1"/>
+    <w:lsdException w:name="HTML Acronym" w:semiHidden="1" w:unhideWhenUsed="1"/>
+    <w:lsdException w:name="HTML Address" w:semiHidden="1" w:unhideWhenUsed="1"/>
+    <w:lsdException w:name="HTML Cite" w:semiHidden="1" w:unhideWhenUsed="1"/>
+    <w:lsdException w:name="HTML Code" w:semiHidden="1" w:unhideWhenUsed="1"/>
+    <w:lsdException w:name="HTML Definition" w:semiHidden="1" w:unhideWhenUsed="1"/>
+    <w:lsdException w:name="HTML Keyboard" w:semiHidden="1" w:unhideWhenUsed="1"/>
+    <w:lsdException w:name="HTML Preformatted" w:semiHidden="1" w:unhideWhenUsed="1"/>
+    <w:lsdException w:name="HTML Sample" w:semiHidden="1" w:unhideWhenUsed="1"/>
+    <w:lsdException w:name="HTML Typewriter" w:semiHidden="1" w:unhideWhenUsed="1"/>
+    <w:lsdException w:name="HTML Variable" w:semiHidden="1" w:unhideWhenUsed="1"/>
+    <w:lsdException w:name="Normal Table" w:semiHidden="1" w:unhideWhenUsed="1"/>
+    <w:lsdException w:name="annotation subject" w:semiHidden="1" w:unhideWhenUsed="1"/>
+    <w:lsdException w:name="No List" w:semiHidden="1" w:unhideWhenUsed="1"/>
+    <w:lsdException w:name="Outline List 1" w:semiHidden="1" w:unhideWhenUsed="1"/>
+    <w:lsdException w:name="Outline List 2" w:semiHidden="1" w:unhideWhenUsed="1"/>
+    <w:lsdException w:name="Outline List 3" w:semiHidden="1" w:unhideWhenUsed="1"/>
+    <w:lsdException w:name="Table Simple 1" w:semiHidden="1" w:unhideWhenUsed="1"/>
+    <w:lsdException w:name="Table Simple 2" w:semiHidden="1" w:unhideWhenUsed="1"/>
+    <w:lsdException w:name="Table Simple 3" w:semiHidden="1" w:unhideWhenUsed="1"/>
+    <w:lsdException w:name="Table Classic 1" w:semiHidden="1" w:unhideWhenUsed="1"/>
+    <w:lsdException w:name="Table Classic 2" w:semiHidden="1" w:unhideWhenUsed="1"/>
+    <w:lsdException w:name="Table Classic 3" w:semiHidden="1" w:unhideWhenUsed="1"/>
+    <w:lsdException w:name="Table Classic 4" w:semiHidden="1" w:unhideWhenUsed="1"/>
+    <w:lsdException w:name="Table Colorful 1" w:semiHidden="1" w:unhideWhenUsed="1"/>
+    <w:lsdException w:name="Table Colorful 2" w:semiHidden="1" w:unhideWhenUsed="1"/>
+    <w:lsdException w:name="Table Colorful 3" w:semiHidden="1" w:unhideWhenUsed="1"/>
+    <w:lsdException w:name="Table Columns 1" w:semiHidden="1" w:unhideWhenUsed="1"/>
+    <w:lsdException w:name="Table Columns 2" w:semiHidden="1" w:unhideWhenUsed="1"/>
+    <w:lsdException w:name="Table Columns 3" w:semiHidden="1" w:unhideWhenUsed="1"/>
+    <w:lsdException w:name="Table Columns 4" w:semiHidden="1" w:unhideWhenUsed="1"/>
+    <w:lsdException w:name="Table Columns 5" w:semiHidden="1" w:unhideWhenUsed="1"/>
+    <w:lsdException w:name="Table Grid 1" w:semiHidden="1" w:unhideWhenUsed="1"/>
+    <w:lsdException w:name="Table Grid 2" w:semiHidden="1" w:unhideWhenUsed="1"/>
+    <w:lsdException w:name="Table Grid 3" w:semiHidden="1" w:unhideWhenUsed="1"/>
+    <w:lsdException w:name="Table Grid 4" w:semiHidden="1" w:unhideWhenUsed="1"/>
+    <w:lsdException w:name="Table Grid 5" w:semiHidden="1" w:unhideWhenUsed="1"/>
+    <w:lsdException w:name="Table Grid 6" w:semiHidden="1" w:unhideWhenUsed="1"/>
+    <w:lsdException w:name="Table Grid 7" w:semiHidden="1" w:unhideWhenUsed="1"/>
+    <w:lsdException w:name="Table Grid 8" w:semiHidden="1" w:unhideWhenUsed="1"/>
+    <w:lsdException w:name="Table List 1" w:semiHidden="1" w:unhideWhenUsed="1"/>
+    <w:lsdException w:name="Table List 2" w:semiHidden="1" w:unhideWhenUsed="1"/>
+    <w:lsdException w:name="Table List 3" w:semiHidden="1" w:unhideWhenUsed="1"/>
+    <w:lsdException w:name="Table List 4" w:semiHidden="1" w:unhideWhenUsed="1"/>
+    <w:lsdException w:name="Table List 5" w:semiHidden="1" w:unhideWhenUsed="1"/>
+    <w:lsdException w:name="Table List 6" w:semiHidden="1" w:unhideWhenUsed="1"/>
+    <w:lsdException w:name="Table List 7" w:semiHidden="1" w:unhideWhenUsed="1"/>
+    <w:lsdException w:name="Table List 8" w:semiHidden="1" w:unhideWhenUsed="1"/>
+    <w:lsdException w:name="Table 3D effects 1" w:semiHidden="1" w:unhideWhenUsed="1"/>
+    <w:lsdException w:name="Table 3D effects 2" w:semiHidden="1" w:unhideWhenUsed="1"/>
+    <w:lsdException w:name="Table 3D effects 3" w:semiHidden="1" w:unhideWhenUsed="1"/>
+    <w:lsdException w:name="Table Contemporary" w:semiHidden="1" w:unhideWhenUsed="1"/>
+    <w:lsdException w:name="Table Elegant" w:semiHidden="1" w:unhideWhenUsed="1"/>
+    <w:lsdException w:name="Table Professional" w:semiHidden="1" w:unhideWhenUsed="1"/>
+    <w:lsdException w:name="Table Subtle 1" w:semiHidden="1" w:unhideWhenUsed="1"/>
+    <w:lsdException w:name="Table Subtle 2" w:semiHidden="1" w:unhideWhenUsed="1"/>
+    <w:lsdException w:name="Table Web 1" w:semiHidden="1" w:unhideWhenUsed="1"/>
+    <w:lsdException w:name="Table Web 2" w:semiHidden="1" w:unhideWhenUsed="1"/>
+    <w:lsdException w:name="Table Web 3" w:semiHidden="1" w:unhideWhenUsed="1"/>
+    <w:lsdException w:name="Balloon Text" w:semiHidden="1" w:unhideWhenUsed="1"/>
+    <w:lsdException w:name="Table Grid" w:uiPriority="39"/>
+    <w:lsdException w:name="Table Theme" w:semiHidden="1" w:unhideWhenUsed="1"/>
+    <w:lsdException w:name="Placeholder Text" w:semiHidden="1"/>
+    <w:lsdException w:name="No Spacing" w:uiPriority="1" w:qFormat="1"/>
+    <w:lsdException w:name="Light Shading" w:uiPriority="60"/>
+    <w:lsdException w:name="Light List" w:uiPriority="61"/>
+    <w:lsdException w:name="Light Grid" w:uiPriority="62"/>
+    <w:lsdException w:name="Medium Shading 1" w:uiPriority="63"/>
+    <w:lsdException w:name="Medium Shading 2" w:uiPriority="64"/>
+    <w:lsdException w:name="Medium List 1" w:uiPriority="65"/>
+    <w:lsdException w:name="Medium List 2" w:uiPriority="66"/>
+    <w:lsdException w:name="Medium Grid 1" w:uiPriority="67"/>
+    <w:lsdException w:name="Medium Grid 2" w:uiPriority="68"/>
+    <w:lsdException w:name="Medium Grid 3" w:uiPriority="69"/>
+    <w:lsdException w:name="Dark List" w:uiPriority="70"/>
+    <w:lsdException w:name="Colorful Shading" w:uiPriority="71"/>
+    <w:lsdException w:name="Colorful List" w:uiPriority="72"/>
+    <w:lsdException w:name="Colorful Grid" w:uiPriority="73"/>
+    <w:lsdException w:name="Light Shading Accent 1" w:uiPriority="60"/>
+    <w:lsdException w:name="Light List Accent 1" w:uiPriority="61"/>
+    <w:lsdException w:name="Light Grid Accent 1" w:uiPriority="62"/>
+    <w:lsdException w:name="Medium Shading 1 Accent 1" w:uiPriority="63"/>
+    <w:lsdException w:name="Medium Shading 2 Accent 1" w:uiPriority="64"/>
+    <w:lsdException w:name="Medium List 1 Accent 1" w:uiPriority="65"/>
+    <w:lsdException w:name="Revision" w:semiHidden="1"/>
+    <w:lsdException w:name="List Paragraph" w:uiPriority="34" w:qFormat="1"/>
+    <w:lsdException w:name="Quote" w:uiPriority="29" w:qFormat="1"/>
+    <w:lsdException w:name="Intense Quote" w:uiPriority="30" w:qFormat="1"/>
+    <w:lsdException w:name="Medium List 2 Accent 1" w:uiPriority="66"/>
+    <w:lsdException w:name="Medium Grid 1 Accent 1" w:uiPriority="67"/>
+    <w:lsdException w:name="Medium Grid 2 Accent 1" w:uiPriority="68"/>
+    <w:lsdException w:name="Medium Grid 3 Accent 1" w:uiPriority="69"/>
+    <w:lsdException w:name="Dark List Accent 1" w:uiPriority="70"/>
+    <w:lsdException w:name="Colorful Shading Accent 1" w:uiPriority="71"/>
+    <w:lsdException w:name="Colorful List Accent 1" w:uiPriority="72"/>
+    <w:lsdException w:name="Colorful Grid Accent 1" w:uiPriority="73"/>
+    <w:lsdException w:name="Light Shading Accent 2" w:uiPriority="60"/>
+    <w:lsdException w:name="Light List Accent 2" w:uiPriority="61"/>
+    <w:lsdException w:name="Light Grid Accent 2" w:uiPriority="62"/>
+    <w:lsdException w:name="Medium Shading 1 Accent 2" w:uiPriority="63"/>
+    <w:lsdException w:name="Medium Shading 2 Accent 2" w:uiPriority="64"/>
+    <w:lsdException w:name="Medium List 1 Accent 2" w:uiPriority="65"/>
+    <w:lsdException w:name="Medium List 2 Accent 2" w:uiPriority="66"/>
+    <w:lsdException w:name="Medium Grid 1 Accent 2" w:uiPriority="67"/>
+    <w:lsdException w:name="Medium Grid 2 Accent 2" w:uiPriority="68"/>
+    <w:lsdException w:name="Medium Grid 3 Accent 2" w:uiPriority="69"/>
+    <w:lsdException w:name="Dark List Accent 2" w:uiPriority="70"/>
+    <w:lsdException w:name="Colorful Shading Accent 2" w:uiPriority="71"/>
+    <w:lsdException w:name="Colorful List Accent 2" w:uiPriority="72"/>
+    <w:lsdException w:name="Colorful Grid Accent 2" w:uiPriority="73"/>
+    <w:lsdException w:name="Light Shading Accent 3" w:uiPriority="60"/>
+    <w:lsdException w:name="Light List Accent 3" w:uiPriority="61"/>
+    <w:lsdException w:name="Light Grid Accent 3" w:uiPriority="62"/>
+    <w:lsdException w:name="Medium Shading 1 Accent 3" w:uiPriority="63"/>
+    <w:lsdException w:name="Medium Shading 2 Accent 3" w:uiPriority="64"/>
+    <w:lsdException w:name="Medium List 1 Accent 3" w:uiPriority="65"/>
+    <w:lsdException w:name="Medium List 2 Accent 3" w:uiPriority="66"/>
+    <w:lsdException w:name="Medium Grid 1 Accent 3" w:uiPriority="67"/>
+    <w:lsdException w:name="Medium Grid 2 Accent 3" w:uiPriority="68"/>
+    <w:lsdException w:name="Medium Grid 3 Accent 3" w:uiPriority="69"/>
+    <w:lsdException w:name="Dark List Accent 3" w:uiPriority="70"/>
+    <w:lsdException w:name="Colorful Shading Accent 3" w:uiPriority="71"/>
+    <w:lsdException w:name="Colorful List Accent 3" w:uiPriority="72"/>
+    <w:lsdException w:name="Colorful Grid Accent 3" w:uiPriority="73"/>
+    <w:lsdException w:name="Light Shading Accent 4" w:uiPriority="60"/>
+    <w:lsdException w:name="Light List Accent 4" w:uiPriority="61"/>
+    <w:lsdException w:name="Light Grid Accent 4" w:uiPriority="62"/>
+    <w:lsdException w:name="Medium Shading 1 Accent 4" w:uiPriority="63"/>
+    <w:lsdException w:name="Medium Shading 2 Accent 4" w:uiPriority="64"/>
+    <w:lsdException w:name="Medium List 1 Accent 4" w:uiPriority="65"/>
+    <w:lsdException w:name="Medium List 2 Accent 4" w:uiPriority="66"/>
+    <w:lsdException w:name="Medium Grid 1 Accent 4" w:uiPriority="67"/>
+    <w:lsdException w:name="Medium Grid 2 Accent 4" w:uiPriority="68"/>
+    <w:lsdException w:name="Medium Grid 3 Accent 4" w:uiPriority="69"/>
+    <w:lsdException w:name="Dark List Accent 4" w:uiPriority="70"/>
+    <w:lsdException w:name="Colorful Shading Accent 4" w:uiPriority="71"/>
+    <w:lsdException w:name="Colorful List Accent 4" w:uiPriority="72"/>
+    <w:lsdException w:name="Colorful Grid Accent 4" w:uiPriority="73"/>
+    <w:lsdException w:name="Light Shading Accent 5" w:uiPriority="60"/>
+    <w:lsdException w:name="Light List Accent 5" w:uiPriority="61"/>
+    <w:lsdException w:name="Light Grid Accent 5" w:uiPriority="62"/>
+    <w:lsdException w:name="Medium Shading 1 Accent 5" w:uiPriority="63"/>
+    <w:lsdException w:name="Medium Shading 2 Accent 5" w:uiPriority="64"/>
+    <w:lsdException w:name="Medium List 1 Accent 5" w:uiPriority="65"/>
+    <w:lsdException w:name="Medium List 2 Accent 5" w:uiPriority="66"/>
+    <w:lsdException w:name="Medium Grid 1 Accent 5" w:uiPriority="67"/>
+    <w:lsdException w:name="Medium Grid 2 Accent 5" w:uiPriority="68"/>
+    <w:lsdException w:name="Medium Grid 3 Accent 5" w:uiPriority="69"/>
+    <w:lsdException w:name="Dark List Accent 5" w:uiPriority="70"/>
+    <w:lsdException w:name="Colorful Shading Accent 5" w:uiPriority="71"/>
+    <w:lsdException w:name="Colorful List Accent 5" w:uiPriority="72"/>
+    <w:lsdException w:name="Colorful Grid Accent 5" w:uiPriority="73"/>
+    <w:lsdException w:name="Light Shading Accent 6" w:uiPriority="60"/>
+    <w:lsdException w:name="Light List Accent 6" w:uiPriority="61"/>
+    <w:lsdException w:name="Light Grid Accent 6" w:uiPriority="62"/>
+    <w:lsdException w:name="Medium Shading 1 Accent 6" w:uiPriority="63"/>
+    <w:lsdException w:name="Medium Shading 2 Accent 6" w:uiPriority="64"/>
+    <w:lsdException w:name="Medium List 1 Accent 6" w:uiPriority="65"/>
+    <w:lsdException w:name="Medium List 2 Accent 6" w:uiPriority="66"/>
+    <w:lsdException w:name="Medium Grid 1 Accent 6" w:uiPriority="67"/>
+    <w:lsdException w:name="Medium Grid 2 Accent 6" w:uiPriority="68"/>
+    <w:lsdException w:name="Medium Grid 3 Accent 6" w:uiPriority="69"/>
+    <w:lsdException w:name="Dark List Accent 6" w:uiPriority="70"/>
+    <w:lsdException w:name="Colorful Shading Accent 6" w:uiPriority="71"/>
+    <w:lsdException w:name="Colorful List Accent 6" w:uiPriority="72"/>
+    <w:lsdException w:name="Colorful Grid Accent 6" w:uiPriority="73"/>
+    <w:lsdException w:name="Subtle Emphasis" w:uiPriority="19" w:qFormat="1"/>
+    <w:lsdException w:name="Intense Emphasis" w:uiPriority="21" w:qFormat="1"/>
+    <w:lsdException w:name="Subtle Reference" w:uiPriority="31" w:qFormat="1"/>
+    <w:lsdException w:name="Intense Reference" w:uiPriority="32" w:qFormat="1"/>
+    <w:lsdException w:name="Book Title" w:uiPriority="33" w:qFormat="1"/>
+    <w:lsdException w:name="Bibliography" w:semiHidden="1" w:uiPriority="37" w:unhideWhenUsed="1"/>
+    <w:lsdException w:name="TOC Heading" w:semiHidden="1" w:uiPriority="39" w:unhideWhenUsed="1" w:qFormat="1"/>
+    <w:lsdException w:name="Plain Table 1" w:uiPriority="41"/>
+    <w:lsdException w:name="Plain Table 2" w:uiPriority="42"/>
+    <w:lsdException w:name="Plain Table 3" w:uiPriority="43"/>
+    <w:lsdException w:name="Plain Table 4" w:uiPriority="44"/>
+    <w:lsdException w:name="Plain Table 5" w:uiPriority="45"/>
+    <w:lsdException w:name="Grid Table Light" w:uiPriority="40"/>
+    <w:lsdException w:name="Grid Table 1 Light" w:uiPriority="46"/>
+    <w:lsdException w:name="Grid Table 2" w:uiPriority="47"/>
+    <w:lsdException w:name="Grid Table 3" w:uiPriority="48"/>
+    <w:lsdException w:name="Grid Table 4" w:uiPriority="49"/>
+    <w:lsdException w:name="Grid Table 5 Dark" w:uiPriority="50"/>
+    <w:lsdException w:name="Grid Table 6 Colorful" w:uiPriority="51"/>
+    <w:lsdException w:name="Grid Table 7 Colorful" w:uiPriority="52"/>
+    <w:lsdException w:name="Grid Table 1 Light Accent 1" w:uiPriority="46"/>
+    <w:lsdException w:name="Grid Table 2 Accent 1" w:uiPriority="47"/>
+    <w:lsdException w:name="Grid Table 3 Accent 1" w:uiPriority="48"/>
+    <w:lsdException w:name="Grid Table 4 Accent 1" w:uiPriority="49"/>
+    <w:lsdException w:name="Grid Table 5 Dark Accent 1" w:uiPriority="50"/>
+    <w:lsdException w:name="Grid Table 6 Colorful Accent 1" w:uiPriority="51"/>
+    <w:lsdException w:name="Grid Table 7 Colorful Accent 1" w:uiPriority="52"/>
+    <w:lsdException w:name="Grid Table 1 Light Accent 2" w:uiPriority="46"/>
+    <w:lsdException w:name="Grid Table 2 Accent 2" w:uiPriority="47"/>
+    <w:lsdException w:name="Grid Table 3 Accent 2" w:uiPriority="48"/>
+    <w:lsdException w:name="Grid Table 4 Accent 2" w:uiPriority="49"/>
+    <w:lsdException w:name="Grid Table 5 Dark Accent 2" w:uiPriority="50"/>
+    <w:lsdException w:name="Grid Table 6 Colorful Accent 2" w:uiPriority="51"/>
+    <w:lsdException w:name="Grid Table 7 Colorful Accent 2" w:uiPriority="52"/>
+    <w:lsdException w:name="Grid Table 1 Light Accent 3" w:uiPriority="46"/>
+    <w:lsdException w:name="Grid Table 2 Accent 3" w:uiPriority="47"/>
+    <w:lsdException w:name="Grid Table 3 Accent 3" w:uiPriority="48"/>
+    <w:lsdException w:name="Grid Table 4 Accent 3" w:uiPriority="49"/>
+    <w:lsdException w:name="Grid Table 5 Dark Accent 3" w:uiPriority="50"/>
+    <w:lsdException w:name="Grid Table 6 Colorful Accent 3" w:uiPriority="51"/>
+    <w:lsdException w:name="Grid Table 7 Colorful Accent 3" w:uiPriority="52"/>
+    <w:lsdException w:name="Grid Table 1 Light Accent 4" w:uiPriority="46"/>
+    <w:lsdException w:name="Grid Table 2 Accent 4" w:uiPriority="47"/>
+    <w:lsdException w:name="Grid Table 3 Accent 4" w:uiPriority="48"/>
+    <w:lsdException w:name="Grid Table 4 Accent 4" w:uiPriority="49"/>
+    <w:lsdException w:name="Grid Table 5 Dark Accent 4" w:uiPriority="50"/>
+    <w:lsdException w:name="Grid Table 6 Colorful Accent 4" w:uiPriority="51"/>
+    <w:lsdException w:name="Grid Table 7 Colorful Accent 4" w:uiPriority="52"/>
+    <w:lsdException w:name="Grid Table 1 Light Accent 5" w:uiPriority="46"/>
+    <w:lsdException w:name="Grid Table 2 Accent 5" w:uiPriority="47"/>
+    <w:lsdException w:name="Grid Table 3 Accent 5" w:uiPriority="48"/>
+    <w:lsdException w:name="Grid Table 4 Accent 5" w:uiPriority="49"/>
+    <w:lsdException w:name="Grid Table 5 Dark Accent 5" w:uiPriority="50"/>
+    <w:lsdException w:name="Grid Table 6 Colorful Accent 5" w:uiPriority="51"/>
+    <w:lsdException w:name="Grid Table 7 Colorful Accent 5" w:uiPriority="52"/>
+    <w:lsdException w:name="Grid Table 1 Light Accent 6" w:uiPriority="46"/>
+    <w:lsdException w:name="Grid Table 2 Accent 6" w:uiPriority="47"/>
+    <w:lsdException w:name="Grid Table 3 Accent 6" w:uiPriority="48"/>
+    <w:lsdException w:name="Grid Table 4 Accent 6" w:uiPriority="49"/>
+    <w:lsdException w:name="Grid Table 5 Dark Accent 6" w:uiPriority="50"/>
+    <w:lsdException w:name="Grid Table 6 Colorful Accent 6" w:uiPriority="51"/>
+    <w:lsdException w:name="Grid Table 7 Colorful Accent 6" w:uiPriority="52"/>
+    <w:lsdException w:name="List Table 1 Light" w:uiPriority="46"/>
+    <w:lsdException w:name="List Table 2" w:uiPriority="47"/>
+    <w:lsdException w:name="List Table 3" w:uiPriority="48"/>
+    <w:lsdException w:name="List Table 4" w:uiPriority="49"/>
+    <w:lsdException w:name="List Table 5 Dark" w:uiPriority="50"/>
+    <w:lsdException w:name="List Table 6 Colorful" w:uiPriority="51"/>
+    <w:lsdException w:name="List Table 7 Colorful" w:uiPriority="52"/>
+    <w:lsdException w:name="List Table 1 Light Accent 1" w:uiPriority="46"/>
+    <w:lsdException w:name="List Table 2 Accent 1" w:uiPriority="47"/>
+    <w:lsdException w:name="List Table 3 Accent 1" w:uiPriority="48"/>
+    <w:lsdException w:name="List Table 4 Accent 1" w:uiPriority="49"/>
+    <w:lsdException w:name="List Table 5 Dark Accent 1" w:uiPriority="50"/>
+    <w:lsdException w:name="List Table 6 Colorful Accent 1" w:uiPriority="51"/>
+    <w:lsdException w:name="List Table 7 Colorful Accent 1" w:uiPriority="52"/>
+    <w:lsdException w:name="List Table 1 Light Accent 2" w:uiPriority="46"/>
+    <w:lsdException w:name="List Table 2 Accent 2" w:uiPriority="47"/>
+    <w:lsdException w:name="List Table 3 Accent 2" w:uiPriority="48"/>
+    <w:lsdException w:name="List Table 4 Accent 2" w:uiPriority="49"/>
+    <w:lsdException w:name="List Table 5 Dark Accent 2" w:uiPriority="50"/>
+    <w:lsdException w:name="List Table 6 Colorful Accent 2" w:uiPriority="51"/>
+    <w:lsdException w:name="List Table 7 Colorful Accent 2" w:uiPriority="52"/>
+    <w:lsdException w:name="List Table 1 Light Accent 3" w:uiPriority="46"/>
+    <w:lsdException w:name="List Table 2 Accent 3" w:uiPriority="47"/>
+    <w:lsdException w:name="List Table 3 Accent 3" w:uiPriority="48"/>
+    <w:lsdException w:name="List Table 4 Accent 3" w:uiPriority="49"/>
+    <w:lsdException w:name="List Table 5 Dark Accent 3" w:uiPriority="50"/>
+    <w:lsdException w:name="List Table 6 Colorful Accent 3" w:uiPriority="51"/>
+    <w:lsdException w:name="List Table 7 Colorful Accent 3" w:uiPriority="52"/>
+    <w:lsdException w:name="List Table 1 Light Accent 4" w:uiPriority="46"/>
+    <w:lsdException w:name="List Table 2 Accent 4" w:uiPriority="47"/>
+    <w:lsdException w:name="List Table 3 Accent 4" w:uiPriority="48"/>
+    <w:lsdException w:name="List Table 4 Accent 4" w:uiPriority="49"/>
+    <w:lsdException w:name="List Table 5 Dark Accent 4" w:uiPriority="50"/>
+    <w:lsdException w:name="List Table 6 Colorful Accent 4" w:uiPriority="51"/>
+    <w:lsdException w:name="List Table 7 Colorful Accent 4" w:uiPriority="52"/>
+    <w:lsdException w:name="List Table 1 Light Accent 5" w:uiPriority="46"/>
+    <w:lsdException w:name="List Table 2 Accent 5" w:uiPriority="47"/>
+    <w:lsdException w:name="List Table 3 Accent 5" w:uiPriority="48"/>
+    <w:lsdException w:name="List Table 4 Accent 5" w:uiPriority="49"/>
+    <w:lsdException w:name="List Table 5 Dark Accent 5" w:uiPriority="50"/>
+    <w:lsdException w:name="List Table 6 Colorful Accent 5" w:uiPriority="51"/>
+    <w:lsdException w:name="List Table 7 Colorful Accent 5" w:uiPriority="52"/>
+    <w:lsdException w:name="List Table 1 Light Accent 6" w:uiPriority="46"/>
+    <w:lsdException w:name="List Table 2 Accent 6" w:uiPriority="47"/>
+    <w:lsdException w:name="List Table 3 Accent 6" w:uiPriority="48"/>
+    <w:lsdException w:name="List Table 4 Accent 6" w:uiPriority="49"/>
+    <w:lsdException w:name="List Table 5 Dark Accent 6" w:uiPriority="50"/>
+    <w:lsdException w:name="List Table 6 Colorful Accent 6" w:uiPriority="51"/>
+    <w:lsdException w:name="List Table 7 Colorful Accent 6" w:uiPriority="52"/>
+    <w:lsdException w:name="Mention" w:semiHidden="1" w:unhideWhenUsed="1"/>
+    <w:lsdException w:name="Smart Hyperlink" w:semiHidden="1" w:unhideWhenUsed="1"/>
+    <w:lsdException w:name="Hashtag" w:semiHidden="1" w:unhideWhenUsed="1"/>
+    <w:lsdException w:name="Unresolved Mention" w:semiHidden="1" w:unhideWhenUsed="1"/>
+    <w:lsdException w:name="Smart Link" w:semiHidden="1" w:unhideWhenUsed="1"/>
+  </w:latentStyles>
+  <w:style w:type="paragraph" w:default="1" w:styleId="Normal">
+    <w:name w:val="Normal"/>
+    <w:qFormat/>
+    <w:rPr>
+      <w:rFonts w:ascii="Times New Roman" w:eastAsia="Times New Roman" w:hAnsi="Times New Roman" w:cs="Times New Roman"/>
+      <w:lang w:val="fr-FR"/>
+    </w:rPr>
+  </w:style>
+  <w:style w:type="paragraph" w:styleId="Titre1">
+    <w:name w:val="heading 1"/>
+    <w:basedOn w:val="Normal"/>
+    <w:uiPriority w:val="9"/>
+    <w:qFormat/>
+    <w:pPr>
+      <w:ind w:left="914" w:right="342"/>
+      <w:jc w:val="center"/>
+      <w:outlineLvl w:val="0"/>
+    </w:pPr>
+    <w:rPr>
+      <w:b/>
+      <w:bCs/>
+      <w:sz w:val="60"/>
+      <w:szCs w:val="60"/>
+    </w:rPr>
+  </w:style>
+  <w:style w:type="character" w:default="1" w:styleId="Policepardfaut">
     <w:name w:val="Default Paragraph Font"/>
     <w:uiPriority w:val="1"/>
     <w:semiHidden/>
     <w:unhideWhenUsed/>
   </w:style>
-  <w:style w:styleId="TableNormal" w:default="1" w:type="table">
+  <w:style w:type="table" w:default="1" w:styleId="TableauNormal">
+    <w:name w:val="Normal Table"/>
+    <w:uiPriority w:val="99"/>
+    <w:semiHidden/>
+    <w:unhideWhenUsed/>
+    <w:tblPr>
+      <w:tblInd w:w="0" w:type="dxa"/>
+      <w:tblCellMar>
+        <w:top w:w="0" w:type="dxa"/>
+        <w:left w:w="108" w:type="dxa"/>
+        <w:bottom w:w="0" w:type="dxa"/>
+        <w:right w:w="108" w:type="dxa"/>
+      </w:tblCellMar>
+    </w:tblPr>
+  </w:style>
+  <w:style w:type="numbering" w:default="1" w:styleId="Aucuneliste">
+    <w:name w:val="No List"/>
+    <w:uiPriority w:val="99"/>
+    <w:semiHidden/>
+    <w:unhideWhenUsed/>
+  </w:style>
+  <w:style w:type="table" w:customStyle="1" w:styleId="TableNormal">
     <w:name w:val="Table Normal"/>
     <w:uiPriority w:val="2"/>
     <w:semiHidden/>
@@ -1655,75 +1955,30 @@
       </w:tblCellMar>
     </w:tblPr>
   </w:style>
-  <w:style w:styleId="NoList" w:default="1" w:type="numbering">
-    <w:name w:val="No List"/>
-    <w:uiPriority w:val="99"/>
-    <w:semiHidden/>
-    <w:unhideWhenUsed/>
-  </w:style>
-  <w:style w:default="1" w:styleId="Normal" w:type="paragraph">
-    <w:name w:val="Normal"/>
-    <w:uiPriority w:val="1"/>
-    <w:qFormat/>
-    <w:pPr/>
-    <w:rPr>
-      <w:rFonts w:ascii="Times New Roman" w:hAnsi="Times New Roman" w:eastAsia="Times New Roman" w:cs="Times New Roman"/>
-      <w:lang w:val="fr-FR" w:eastAsia="en-US" w:bidi="ar-SA"/>
-    </w:rPr>
-  </w:style>
-  <w:style w:styleId="BodyText" w:type="paragraph">
+  <w:style w:type="paragraph" w:styleId="Corpsdetexte">
     <w:name w:val="Body Text"/>
     <w:basedOn w:val="Normal"/>
     <w:uiPriority w:val="1"/>
     <w:qFormat/>
-    <w:pPr/>
     <w:rPr>
-      <w:rFonts w:ascii="Calibri" w:hAnsi="Calibri" w:eastAsia="Calibri" w:cs="Calibri"/>
+      <w:rFonts w:ascii="Calibri" w:eastAsia="Calibri" w:hAnsi="Calibri" w:cs="Calibri"/>
       <w:i/>
       <w:iCs/>
       <w:sz w:val="28"/>
       <w:szCs w:val="28"/>
-      <w:lang w:val="fr-FR" w:eastAsia="en-US" w:bidi="ar-SA"/>
     </w:rPr>
   </w:style>
-  <w:style w:styleId="Heading1" w:type="paragraph">
-    <w:name w:val="Heading 1"/>
-    <w:basedOn w:val="Normal"/>
-    <w:uiPriority w:val="1"/>
-    <w:qFormat/>
-    <w:pPr>
-      <w:ind w:left="914" w:right="342"/>
-      <w:jc w:val="center"/>
-      <w:outlineLvl w:val="1"/>
-    </w:pPr>
-    <w:rPr>
-      <w:rFonts w:ascii="Times New Roman" w:hAnsi="Times New Roman" w:eastAsia="Times New Roman" w:cs="Times New Roman"/>
-      <w:b/>
-      <w:bCs/>
-      <w:sz w:val="60"/>
-      <w:szCs w:val="60"/>
-      <w:lang w:val="fr-FR" w:eastAsia="en-US" w:bidi="ar-SA"/>
-    </w:rPr>
-  </w:style>
-  <w:style w:styleId="ListParagraph" w:type="paragraph">
+  <w:style w:type="paragraph" w:styleId="Paragraphedeliste">
     <w:name w:val="List Paragraph"/>
     <w:basedOn w:val="Normal"/>
     <w:uiPriority w:val="1"/>
     <w:qFormat/>
-    <w:pPr/>
-    <w:rPr>
-      <w:lang w:val="fr-FR" w:eastAsia="en-US" w:bidi="ar-SA"/>
-    </w:rPr>
   </w:style>
-  <w:style w:styleId="TableParagraph" w:type="paragraph">
+  <w:style w:type="paragraph" w:customStyle="1" w:styleId="TableParagraph">
     <w:name w:val="Table Paragraph"/>
     <w:basedOn w:val="Normal"/>
     <w:uiPriority w:val="1"/>
     <w:qFormat/>
-    <w:pPr/>
-    <w:rPr>
-      <w:lang w:val="fr-FR" w:eastAsia="en-US" w:bidi="ar-SA"/>
-    </w:rPr>
   </w:style>
 </w:styles>
 </file>

</xml_diff>